<commit_message>
Actualizacion 2.4 y Correcion nombre
Se actualizo correctamente la guia 2.4 Guiaestudiante y se puso el nombre correcto a diarioreflexion
</commit_message>
<xml_diff>
--- a/Fase 2/Evidencias Grupales/2.4_GuiaEstudiante_Fase 2_DesarrolloProyecto APT.docx
+++ b/Fase 2/Evidencias Grupales/2.4_GuiaEstudiante_Fase 2_DesarrolloProyecto APT.docx
@@ -570,7 +570,7 @@
     <w:tbl>
       <w:tblPr>
         <w:tblStyle w:val="Tablaconcuadrcula"/>
-        <w:tblW w:w="9639" w:type="dxa"/>
+        <w:tblW w:w="9683" w:type="dxa"/>
         <w:tblInd w:w="-572" w:type="dxa"/>
         <w:tblBorders>
           <w:top w:val="single" w:sz="4" w:space="0" w:color="BFBFBF" w:themeColor="background1" w:themeShade="BF"/>
@@ -583,13 +583,16 @@
         <w:tblLook w:val="04A0" w:firstRow="1" w:lastRow="0" w:firstColumn="1" w:lastColumn="0" w:noHBand="0" w:noVBand="1"/>
       </w:tblPr>
       <w:tblGrid>
-        <w:gridCol w:w="2528"/>
-        <w:gridCol w:w="7111"/>
+        <w:gridCol w:w="2539"/>
+        <w:gridCol w:w="7144"/>
       </w:tblGrid>
       <w:tr>
+        <w:trPr>
+          <w:trHeight w:val="1189"/>
+        </w:trPr>
         <w:tc>
           <w:tcPr>
-            <w:tcW w:w="2528" w:type="dxa"/>
+            <w:tcW w:w="2539" w:type="dxa"/>
             <w:vAlign w:val="center"/>
           </w:tcPr>
           <w:p>
@@ -624,7 +627,7 @@
         </w:tc>
         <w:tc>
           <w:tcPr>
-            <w:tcW w:w="7111" w:type="dxa"/>
+            <w:tcW w:w="7144" w:type="dxa"/>
           </w:tcPr>
           <w:p>
             <w:pPr>
@@ -667,7 +670,7 @@
                 <w:szCs w:val="20"/>
                 <w:lang w:eastAsia="es-CL"/>
               </w:rPr>
-              <w:t>. Se implementaron los scripts de migración SQL (001 a 004) que establecen los identificadores estables y la extracción de atributos. Además, se ejecutó con éxito una Prueba de Concepto (</w:t>
+              <w:t>. Se implementaron los scripts de migración SQL (del 001 al 004) que establecen los identificadores estables y la extracción de atributos. Además, se ejecutó con éxito una Prueba de Concepto (</w:t>
             </w:r>
             <w:proofErr w:type="spellStart"/>
             <w:r>
@@ -711,7 +714,7 @@
                 <w:szCs w:val="20"/>
                 <w:lang w:eastAsia="es-CL"/>
               </w:rPr>
-              <w:t xml:space="preserve"> (enfocada en Maicao) y se generaron los </w:t>
+              <w:t xml:space="preserve"> (enfocada en tiendas e-</w:t>
             </w:r>
             <w:proofErr w:type="spellStart"/>
             <w:r>
@@ -722,6 +725,50 @@
                 <w:szCs w:val="20"/>
                 <w:lang w:eastAsia="es-CL"/>
               </w:rPr>
+              <w:t>commerce</w:t>
+            </w:r>
+            <w:proofErr w:type="spellEnd"/>
+            <w:r>
+              <w:rPr>
+                <w:rFonts w:ascii="Calibri" w:hAnsi="Calibri" w:cs="Arial"/>
+                <w:color w:val="548DD4"/>
+                <w:sz w:val="20"/>
+                <w:szCs w:val="20"/>
+                <w:lang w:eastAsia="es-CL"/>
+              </w:rPr>
+              <w:t xml:space="preserve"> como Maicao y </w:t>
+            </w:r>
+            <w:proofErr w:type="spellStart"/>
+            <w:r>
+              <w:rPr>
+                <w:rFonts w:ascii="Calibri" w:hAnsi="Calibri" w:cs="Arial"/>
+                <w:color w:val="548DD4"/>
+                <w:sz w:val="20"/>
+                <w:szCs w:val="20"/>
+                <w:lang w:eastAsia="es-CL"/>
+              </w:rPr>
+              <w:t>Salcobrand</w:t>
+            </w:r>
+            <w:proofErr w:type="spellEnd"/>
+            <w:r>
+              <w:rPr>
+                <w:rFonts w:ascii="Calibri" w:hAnsi="Calibri" w:cs="Arial"/>
+                <w:color w:val="548DD4"/>
+                <w:sz w:val="20"/>
+                <w:szCs w:val="20"/>
+                <w:lang w:eastAsia="es-CL"/>
+              </w:rPr>
+              <w:t xml:space="preserve">) y se generaron los </w:t>
+            </w:r>
+            <w:proofErr w:type="spellStart"/>
+            <w:r>
+              <w:rPr>
+                <w:rFonts w:ascii="Calibri" w:hAnsi="Calibri" w:cs="Arial"/>
+                <w:color w:val="548DD4"/>
+                <w:sz w:val="20"/>
+                <w:szCs w:val="20"/>
+                <w:lang w:eastAsia="es-CL"/>
+              </w:rPr>
               <w:t>datasets</w:t>
             </w:r>
             <w:proofErr w:type="spellEnd"/>
@@ -733,7 +780,7 @@
                 <w:szCs w:val="20"/>
                 <w:lang w:eastAsia="es-CL"/>
               </w:rPr>
-              <w:t xml:space="preserve"> iniciales etiquetados para entrenar el modelo de coincidencia (</w:t>
+              <w:t xml:space="preserve"> iniciales etiquetados para entrenar y validar el modelo de coincidencia (</w:t>
             </w:r>
             <w:proofErr w:type="spellStart"/>
             <w:r>
@@ -744,6 +791,28 @@
                 <w:szCs w:val="20"/>
                 <w:lang w:eastAsia="es-CL"/>
               </w:rPr>
+              <w:t>product</w:t>
+            </w:r>
+            <w:proofErr w:type="spellEnd"/>
+            <w:r>
+              <w:rPr>
+                <w:rFonts w:ascii="Calibri" w:hAnsi="Calibri" w:cs="Arial"/>
+                <w:color w:val="548DD4"/>
+                <w:sz w:val="20"/>
+                <w:szCs w:val="20"/>
+                <w:lang w:eastAsia="es-CL"/>
+              </w:rPr>
+              <w:t xml:space="preserve"> </w:t>
+            </w:r>
+            <w:proofErr w:type="spellStart"/>
+            <w:r>
+              <w:rPr>
+                <w:rFonts w:ascii="Calibri" w:hAnsi="Calibri" w:cs="Arial"/>
+                <w:color w:val="548DD4"/>
+                <w:sz w:val="20"/>
+                <w:szCs w:val="20"/>
+                <w:lang w:eastAsia="es-CL"/>
+              </w:rPr>
               <w:t>matching</w:t>
             </w:r>
             <w:proofErr w:type="spellEnd"/>
@@ -755,7 +824,7 @@
                 <w:szCs w:val="20"/>
                 <w:lang w:eastAsia="es-CL"/>
               </w:rPr>
-              <w:t xml:space="preserve">) de productos. Esto asegura una base sólida de datos antes de integrar el </w:t>
+              <w:t xml:space="preserve">) de productos. Esto asegura una base sólida de datos unificados antes de la integración completa del </w:t>
             </w:r>
             <w:proofErr w:type="spellStart"/>
             <w:r>
@@ -777,18 +846,18 @@
                 <w:szCs w:val="20"/>
                 <w:lang w:eastAsia="es-CL"/>
               </w:rPr>
-              <w:t xml:space="preserve"> de Inteligencia Artificial.</w:t>
+              <w:t xml:space="preserve"> e Inteligencia Artificial.</w:t>
             </w:r>
           </w:p>
         </w:tc>
       </w:tr>
       <w:tr>
         <w:trPr>
-          <w:trHeight w:val="1247"/>
+          <w:trHeight w:val="654"/>
         </w:trPr>
         <w:tc>
           <w:tcPr>
-            <w:tcW w:w="2528" w:type="dxa"/>
+            <w:tcW w:w="2539" w:type="dxa"/>
             <w:vAlign w:val="center"/>
           </w:tcPr>
           <w:p>
@@ -809,7 +878,7 @@
         </w:tc>
         <w:tc>
           <w:tcPr>
-            <w:tcW w:w="7111" w:type="dxa"/>
+            <w:tcW w:w="7144" w:type="dxa"/>
             <w:vAlign w:val="center"/>
           </w:tcPr>
           <w:p>
@@ -841,11 +910,11 @@
       </w:tr>
       <w:tr>
         <w:trPr>
-          <w:trHeight w:val="939"/>
+          <w:trHeight w:val="493"/>
         </w:trPr>
         <w:tc>
           <w:tcPr>
-            <w:tcW w:w="2528" w:type="dxa"/>
+            <w:tcW w:w="2539" w:type="dxa"/>
             <w:vAlign w:val="center"/>
           </w:tcPr>
           <w:p>
@@ -866,7 +935,7 @@
         </w:tc>
         <w:tc>
           <w:tcPr>
-            <w:tcW w:w="7111" w:type="dxa"/>
+            <w:tcW w:w="7144" w:type="dxa"/>
             <w:vAlign w:val="center"/>
           </w:tcPr>
           <w:p>
@@ -897,11 +966,11 @@
       </w:tr>
       <w:tr>
         <w:trPr>
-          <w:trHeight w:val="2377"/>
+          <w:trHeight w:val="1248"/>
         </w:trPr>
         <w:tc>
           <w:tcPr>
-            <w:tcW w:w="2528" w:type="dxa"/>
+            <w:tcW w:w="2539" w:type="dxa"/>
             <w:vAlign w:val="center"/>
           </w:tcPr>
           <w:p>
@@ -922,7 +991,7 @@
         </w:tc>
         <w:tc>
           <w:tcPr>
-            <w:tcW w:w="7111" w:type="dxa"/>
+            <w:tcW w:w="7144" w:type="dxa"/>
             <w:vAlign w:val="center"/>
           </w:tcPr>
           <w:p>
@@ -930,6 +999,386 @@
               <w:jc w:val="both"/>
               <w:rPr>
                 <w:rFonts w:ascii="Calibri" w:hAnsi="Calibri" w:cs="Arial"/>
+                <w:i/>
+                <w:color w:val="548DD4"/>
+                <w:sz w:val="20"/>
+                <w:szCs w:val="20"/>
+                <w:lang w:eastAsia="es-CL"/>
+              </w:rPr>
+            </w:pPr>
+            <w:r>
+              <w:rPr>
+                <w:rFonts w:ascii="Calibri" w:hAnsi="Calibri" w:cs="Arial"/>
+                <w:i/>
+                <w:color w:val="548DD4"/>
+                <w:sz w:val="20"/>
+                <w:szCs w:val="20"/>
+                <w:lang w:eastAsia="es-CL"/>
+              </w:rPr>
+              <w:t>Las evidencias presentadas corresponden a:</w:t>
+            </w:r>
+          </w:p>
+          <w:p>
+            <w:pPr>
+              <w:jc w:val="both"/>
+              <w:rPr>
+                <w:rFonts w:ascii="Calibri" w:hAnsi="Calibri" w:cs="Arial"/>
+                <w:i/>
+                <w:color w:val="548DD4"/>
+                <w:sz w:val="20"/>
+                <w:szCs w:val="20"/>
+                <w:lang w:eastAsia="es-CL"/>
+              </w:rPr>
+            </w:pPr>
+            <w:r>
+              <w:rPr>
+                <w:rFonts w:ascii="Calibri" w:hAnsi="Calibri" w:cs="Arial"/>
+                <w:i/>
+                <w:color w:val="548DD4"/>
+                <w:sz w:val="20"/>
+                <w:szCs w:val="20"/>
+                <w:lang w:eastAsia="es-CL"/>
+              </w:rPr>
+              <w:t>-</w:t>
+            </w:r>
+            <w:r>
+              <w:rPr>
+                <w:rFonts w:ascii="Calibri" w:hAnsi="Calibri" w:cs="Arial"/>
+                <w:i/>
+                <w:color w:val="548DD4"/>
+                <w:sz w:val="20"/>
+                <w:szCs w:val="20"/>
+                <w:lang w:eastAsia="es-CL"/>
+              </w:rPr>
+              <w:t>Scripts iniciales de Base de Datos (</w:t>
+            </w:r>
+            <w:proofErr w:type="spellStart"/>
+            <w:r>
+              <w:rPr>
+                <w:rFonts w:ascii="Calibri" w:hAnsi="Calibri" w:cs="Arial"/>
+                <w:i/>
+                <w:color w:val="548DD4"/>
+                <w:sz w:val="20"/>
+                <w:szCs w:val="20"/>
+                <w:lang w:eastAsia="es-CL"/>
+              </w:rPr>
+              <w:t>database</w:t>
+            </w:r>
+            <w:proofErr w:type="spellEnd"/>
+            <w:r>
+              <w:rPr>
+                <w:rFonts w:ascii="Calibri" w:hAnsi="Calibri" w:cs="Arial"/>
+                <w:i/>
+                <w:color w:val="548DD4"/>
+                <w:sz w:val="20"/>
+                <w:szCs w:val="20"/>
+                <w:lang w:eastAsia="es-CL"/>
+              </w:rPr>
+              <w:t>/): Migraciones SQL de la 001 a la 004 para esquemas d</w:t>
+            </w:r>
+            <w:r>
+              <w:rPr>
+                <w:rFonts w:ascii="Calibri" w:hAnsi="Calibri" w:cs="Arial"/>
+                <w:i/>
+                <w:color w:val="548DD4"/>
+                <w:sz w:val="20"/>
+                <w:szCs w:val="20"/>
+                <w:lang w:eastAsia="es-CL"/>
+              </w:rPr>
+              <w:t xml:space="preserve">e catálogo, marcas y </w:t>
+            </w:r>
+            <w:proofErr w:type="spellStart"/>
+            <w:r>
+              <w:rPr>
+                <w:rFonts w:ascii="Calibri" w:hAnsi="Calibri" w:cs="Arial"/>
+                <w:i/>
+                <w:color w:val="548DD4"/>
+                <w:sz w:val="20"/>
+                <w:szCs w:val="20"/>
+                <w:lang w:eastAsia="es-CL"/>
+              </w:rPr>
+              <w:t>precios.</w:t>
+            </w:r>
+          </w:p>
+          <w:p>
+            <w:pPr>
+              <w:jc w:val="both"/>
+              <w:rPr>
+                <w:rFonts w:ascii="Calibri" w:hAnsi="Calibri" w:cs="Arial"/>
+                <w:i/>
+                <w:color w:val="548DD4"/>
+                <w:sz w:val="20"/>
+                <w:szCs w:val="20"/>
+                <w:lang w:eastAsia="es-CL"/>
+              </w:rPr>
+            </w:pPr>
+            <w:proofErr w:type="spellEnd"/>
+            <w:r>
+              <w:rPr>
+                <w:rFonts w:ascii="Calibri" w:hAnsi="Calibri" w:cs="Arial"/>
+                <w:i/>
+                <w:color w:val="548DD4"/>
+                <w:sz w:val="20"/>
+                <w:szCs w:val="20"/>
+                <w:lang w:eastAsia="es-CL"/>
+              </w:rPr>
+              <w:t>-</w:t>
+            </w:r>
+            <w:proofErr w:type="spellStart"/>
+            <w:r>
+              <w:rPr>
+                <w:rFonts w:ascii="Calibri" w:hAnsi="Calibri" w:cs="Arial"/>
+                <w:i/>
+                <w:color w:val="548DD4"/>
+                <w:sz w:val="20"/>
+                <w:szCs w:val="20"/>
+                <w:lang w:eastAsia="es-CL"/>
+              </w:rPr>
+              <w:t>Datasets</w:t>
+            </w:r>
+            <w:proofErr w:type="spellEnd"/>
+            <w:r>
+              <w:rPr>
+                <w:rFonts w:ascii="Calibri" w:hAnsi="Calibri" w:cs="Arial"/>
+                <w:i/>
+                <w:color w:val="548DD4"/>
+                <w:sz w:val="20"/>
+                <w:szCs w:val="20"/>
+                <w:lang w:eastAsia="es-CL"/>
+              </w:rPr>
+              <w:t xml:space="preserve"> de coincidencia para IA (data/</w:t>
+            </w:r>
+            <w:proofErr w:type="spellStart"/>
+            <w:r>
+              <w:rPr>
+                <w:rFonts w:ascii="Calibri" w:hAnsi="Calibri" w:cs="Arial"/>
+                <w:i/>
+                <w:color w:val="548DD4"/>
+                <w:sz w:val="20"/>
+                <w:szCs w:val="20"/>
+                <w:lang w:eastAsia="es-CL"/>
+              </w:rPr>
+              <w:t>labeled</w:t>
+            </w:r>
+            <w:proofErr w:type="spellEnd"/>
+            <w:r>
+              <w:rPr>
+                <w:rFonts w:ascii="Calibri" w:hAnsi="Calibri" w:cs="Arial"/>
+                <w:i/>
+                <w:color w:val="548DD4"/>
+                <w:sz w:val="20"/>
+                <w:szCs w:val="20"/>
+                <w:lang w:eastAsia="es-CL"/>
+              </w:rPr>
+              <w:t>/): Datos etiquetados y preparados para e</w:t>
+            </w:r>
+            <w:r>
+              <w:rPr>
+                <w:rFonts w:ascii="Calibri" w:hAnsi="Calibri" w:cs="Arial"/>
+                <w:i/>
+                <w:color w:val="548DD4"/>
+                <w:sz w:val="20"/>
+                <w:szCs w:val="20"/>
+                <w:lang w:eastAsia="es-CL"/>
+              </w:rPr>
+              <w:t xml:space="preserve">valuar el modelo de </w:t>
+            </w:r>
+            <w:proofErr w:type="spellStart"/>
+            <w:r>
+              <w:rPr>
+                <w:rFonts w:ascii="Calibri" w:hAnsi="Calibri" w:cs="Arial"/>
+                <w:i/>
+                <w:color w:val="548DD4"/>
+                <w:sz w:val="20"/>
+                <w:szCs w:val="20"/>
+                <w:lang w:eastAsia="es-CL"/>
+              </w:rPr>
+              <w:t>matching.</w:t>
+            </w:r>
+          </w:p>
+          <w:p>
+            <w:pPr>
+              <w:jc w:val="both"/>
+              <w:rPr>
+                <w:rFonts w:ascii="Calibri" w:hAnsi="Calibri" w:cs="Arial"/>
+                <w:i/>
+                <w:color w:val="548DD4"/>
+                <w:sz w:val="20"/>
+                <w:szCs w:val="20"/>
+                <w:lang w:eastAsia="es-CL"/>
+              </w:rPr>
+            </w:pPr>
+            <w:proofErr w:type="spellEnd"/>
+            <w:r>
+              <w:rPr>
+                <w:rFonts w:ascii="Calibri" w:hAnsi="Calibri" w:cs="Arial"/>
+                <w:i/>
+                <w:color w:val="548DD4"/>
+                <w:sz w:val="20"/>
+                <w:szCs w:val="20"/>
+                <w:lang w:eastAsia="es-CL"/>
+              </w:rPr>
+              <w:t>-</w:t>
+            </w:r>
+            <w:r>
+              <w:rPr>
+                <w:rFonts w:ascii="Calibri" w:hAnsi="Calibri" w:cs="Arial"/>
+                <w:i/>
+                <w:color w:val="548DD4"/>
+                <w:sz w:val="20"/>
+                <w:szCs w:val="20"/>
+                <w:lang w:eastAsia="es-CL"/>
+              </w:rPr>
+              <w:t xml:space="preserve">Documentación técnica y </w:t>
+            </w:r>
+            <w:proofErr w:type="spellStart"/>
+            <w:r>
+              <w:rPr>
+                <w:rFonts w:ascii="Calibri" w:hAnsi="Calibri" w:cs="Arial"/>
+                <w:i/>
+                <w:color w:val="548DD4"/>
+                <w:sz w:val="20"/>
+                <w:szCs w:val="20"/>
+                <w:lang w:eastAsia="es-CL"/>
+              </w:rPr>
+              <w:t>PoC</w:t>
+            </w:r>
+            <w:proofErr w:type="spellEnd"/>
+            <w:r>
+              <w:rPr>
+                <w:rFonts w:ascii="Calibri" w:hAnsi="Calibri" w:cs="Arial"/>
+                <w:i/>
+                <w:color w:val="548DD4"/>
+                <w:sz w:val="20"/>
+                <w:szCs w:val="20"/>
+                <w:lang w:eastAsia="es-CL"/>
+              </w:rPr>
+              <w:t xml:space="preserve"> de </w:t>
+            </w:r>
+            <w:proofErr w:type="spellStart"/>
+            <w:r>
+              <w:rPr>
+                <w:rFonts w:ascii="Calibri" w:hAnsi="Calibri" w:cs="Arial"/>
+                <w:i/>
+                <w:color w:val="548DD4"/>
+                <w:sz w:val="20"/>
+                <w:szCs w:val="20"/>
+                <w:lang w:eastAsia="es-CL"/>
+              </w:rPr>
+              <w:t>Scraping</w:t>
+            </w:r>
+            <w:proofErr w:type="spellEnd"/>
+            <w:r>
+              <w:rPr>
+                <w:rFonts w:ascii="Calibri" w:hAnsi="Calibri" w:cs="Arial"/>
+                <w:i/>
+                <w:color w:val="548DD4"/>
+                <w:sz w:val="20"/>
+                <w:szCs w:val="20"/>
+                <w:lang w:eastAsia="es-CL"/>
+              </w:rPr>
+              <w:t xml:space="preserve"> (</w:t>
+            </w:r>
+            <w:proofErr w:type="spellStart"/>
+            <w:r>
+              <w:rPr>
+                <w:rFonts w:ascii="Calibri" w:hAnsi="Calibri" w:cs="Arial"/>
+                <w:i/>
+                <w:color w:val="548DD4"/>
+                <w:sz w:val="20"/>
+                <w:szCs w:val="20"/>
+                <w:lang w:eastAsia="es-CL"/>
+              </w:rPr>
+              <w:t>docs</w:t>
+            </w:r>
+            <w:proofErr w:type="spellEnd"/>
+            <w:r>
+              <w:rPr>
+                <w:rFonts w:ascii="Calibri" w:hAnsi="Calibri" w:cs="Arial"/>
+                <w:i/>
+                <w:color w:val="548DD4"/>
+                <w:sz w:val="20"/>
+                <w:szCs w:val="20"/>
+                <w:lang w:eastAsia="es-CL"/>
+              </w:rPr>
+              <w:t>/</w:t>
+            </w:r>
+            <w:proofErr w:type="spellStart"/>
+            <w:r>
+              <w:rPr>
+                <w:rFonts w:ascii="Calibri" w:hAnsi="Calibri" w:cs="Arial"/>
+                <w:i/>
+                <w:color w:val="548DD4"/>
+                <w:sz w:val="20"/>
+                <w:szCs w:val="20"/>
+                <w:lang w:eastAsia="es-CL"/>
+              </w:rPr>
+              <w:t>scraping</w:t>
+            </w:r>
+            <w:proofErr w:type="spellEnd"/>
+            <w:r>
+              <w:rPr>
+                <w:rFonts w:ascii="Calibri" w:hAnsi="Calibri" w:cs="Arial"/>
+                <w:i/>
+                <w:color w:val="548DD4"/>
+                <w:sz w:val="20"/>
+                <w:szCs w:val="20"/>
+                <w:lang w:eastAsia="es-CL"/>
+              </w:rPr>
+              <w:t>/</w:t>
+            </w:r>
+            <w:r>
+              <w:rPr>
+                <w:rFonts w:ascii="Calibri" w:hAnsi="Calibri" w:cs="Arial"/>
+                <w:i/>
+                <w:color w:val="548DD4"/>
+                <w:sz w:val="20"/>
+                <w:szCs w:val="20"/>
+                <w:lang w:eastAsia="es-CL"/>
+              </w:rPr>
+              <w:t xml:space="preserve">maicao-poc.md): </w:t>
+            </w:r>
+            <w:r>
+              <w:rPr>
+                <w:rFonts w:ascii="Calibri" w:hAnsi="Calibri" w:cs="Arial"/>
+                <w:i/>
+                <w:color w:val="548DD4"/>
+                <w:sz w:val="20"/>
+                <w:szCs w:val="20"/>
+                <w:lang w:eastAsia="es-CL"/>
+              </w:rPr>
+              <w:t xml:space="preserve">Evidencia de la recolección y normalización automatizada de datos desde sitios </w:t>
+            </w:r>
+            <w:proofErr w:type="spellStart"/>
+            <w:r>
+              <w:rPr>
+                <w:rFonts w:ascii="Calibri" w:hAnsi="Calibri" w:cs="Arial"/>
+                <w:i/>
+                <w:color w:val="548DD4"/>
+                <w:sz w:val="20"/>
+                <w:szCs w:val="20"/>
+                <w:lang w:eastAsia="es-CL"/>
+              </w:rPr>
+              <w:t>retail</w:t>
+            </w:r>
+            <w:proofErr w:type="spellEnd"/>
+            <w:r>
+              <w:rPr>
+                <w:rFonts w:ascii="Calibri" w:hAnsi="Calibri" w:cs="Arial"/>
+                <w:i/>
+                <w:color w:val="548DD4"/>
+                <w:sz w:val="20"/>
+                <w:szCs w:val="20"/>
+                <w:lang w:eastAsia="es-CL"/>
+              </w:rPr>
+              <w:t>.</w:t>
+            </w:r>
+          </w:p>
+          <w:p>
+            <w:pPr>
+              <w:jc w:val="both"/>
+              <w:rPr>
+                <w:rFonts w:ascii="Calibri" w:hAnsi="Calibri" w:cs="Arial"/>
                 <w:b/>
                 <w:i/>
                 <w:color w:val="548DD4"/>
@@ -947,7 +1396,18 @@
                 <w:szCs w:val="20"/>
                 <w:lang w:eastAsia="es-CL"/>
               </w:rPr>
-              <w:t>Las evidencias presentadas corresponden a los scripts iniciales de la Base de Datos (</w:t>
+              <w:t>-</w:t>
+            </w:r>
+            <w:r>
+              <w:rPr>
+                <w:rFonts w:ascii="Calibri" w:hAnsi="Calibri" w:cs="Arial"/>
+                <w:i/>
+                <w:color w:val="548DD4"/>
+                <w:sz w:val="20"/>
+                <w:szCs w:val="20"/>
+                <w:lang w:eastAsia="es-CL"/>
+              </w:rPr>
+              <w:t xml:space="preserve"> Resguardo de calidad y control de errores (known_data_issues.md): Documentación de inconsistencias detectadas y sistema de colas de revisión manual (</w:t>
             </w:r>
             <w:proofErr w:type="spellStart"/>
             <w:r>
@@ -959,7 +1419,7 @@
                 <w:szCs w:val="20"/>
                 <w:lang w:eastAsia="es-CL"/>
               </w:rPr>
-              <w:t>database</w:t>
+              <w:t>review_queue</w:t>
             </w:r>
             <w:proofErr w:type="spellEnd"/>
             <w:r>
@@ -971,151 +1431,7 @@
                 <w:szCs w:val="20"/>
                 <w:lang w:eastAsia="es-CL"/>
               </w:rPr>
-              <w:t xml:space="preserve">/), los </w:t>
-            </w:r>
-            <w:proofErr w:type="spellStart"/>
-            <w:r>
-              <w:rPr>
-                <w:rFonts w:ascii="Calibri" w:hAnsi="Calibri" w:cs="Arial"/>
-                <w:i/>
-                <w:color w:val="548DD4"/>
-                <w:sz w:val="20"/>
-                <w:szCs w:val="20"/>
-                <w:lang w:eastAsia="es-CL"/>
-              </w:rPr>
-              <w:t>datasets</w:t>
-            </w:r>
-            <w:proofErr w:type="spellEnd"/>
-            <w:r>
-              <w:rPr>
-                <w:rFonts w:ascii="Calibri" w:hAnsi="Calibri" w:cs="Arial"/>
-                <w:i/>
-                <w:color w:val="548DD4"/>
-                <w:sz w:val="20"/>
-                <w:szCs w:val="20"/>
-                <w:lang w:eastAsia="es-CL"/>
-              </w:rPr>
-              <w:t xml:space="preserve"> de coincidencia para IA (data/</w:t>
-            </w:r>
-            <w:proofErr w:type="spellStart"/>
-            <w:r>
-              <w:rPr>
-                <w:rFonts w:ascii="Calibri" w:hAnsi="Calibri" w:cs="Arial"/>
-                <w:i/>
-                <w:color w:val="548DD4"/>
-                <w:sz w:val="20"/>
-                <w:szCs w:val="20"/>
-                <w:lang w:eastAsia="es-CL"/>
-              </w:rPr>
-              <w:t>labeled</w:t>
-            </w:r>
-            <w:proofErr w:type="spellEnd"/>
-            <w:r>
-              <w:rPr>
-                <w:rFonts w:ascii="Calibri" w:hAnsi="Calibri" w:cs="Arial"/>
-                <w:i/>
-                <w:color w:val="548DD4"/>
-                <w:sz w:val="20"/>
-                <w:szCs w:val="20"/>
-                <w:lang w:eastAsia="es-CL"/>
-              </w:rPr>
-              <w:t xml:space="preserve">/) y la documentación técnica de la </w:t>
-            </w:r>
-            <w:proofErr w:type="spellStart"/>
-            <w:r>
-              <w:rPr>
-                <w:rFonts w:ascii="Calibri" w:hAnsi="Calibri" w:cs="Arial"/>
-                <w:i/>
-                <w:color w:val="548DD4"/>
-                <w:sz w:val="20"/>
-                <w:szCs w:val="20"/>
-                <w:lang w:eastAsia="es-CL"/>
-              </w:rPr>
-              <w:t>PoC</w:t>
-            </w:r>
-            <w:proofErr w:type="spellEnd"/>
-            <w:r>
-              <w:rPr>
-                <w:rFonts w:ascii="Calibri" w:hAnsi="Calibri" w:cs="Arial"/>
-                <w:i/>
-                <w:color w:val="548DD4"/>
-                <w:sz w:val="20"/>
-                <w:szCs w:val="20"/>
-                <w:lang w:eastAsia="es-CL"/>
-              </w:rPr>
-              <w:t xml:space="preserve"> de </w:t>
-            </w:r>
-            <w:proofErr w:type="spellStart"/>
-            <w:r>
-              <w:rPr>
-                <w:rFonts w:ascii="Calibri" w:hAnsi="Calibri" w:cs="Arial"/>
-                <w:i/>
-                <w:color w:val="548DD4"/>
-                <w:sz w:val="20"/>
-                <w:szCs w:val="20"/>
-                <w:lang w:eastAsia="es-CL"/>
-              </w:rPr>
-              <w:t>scraping</w:t>
-            </w:r>
-            <w:proofErr w:type="spellEnd"/>
-            <w:r>
-              <w:rPr>
-                <w:rFonts w:ascii="Calibri" w:hAnsi="Calibri" w:cs="Arial"/>
-                <w:i/>
-                <w:color w:val="548DD4"/>
-                <w:sz w:val="20"/>
-                <w:szCs w:val="20"/>
-                <w:lang w:eastAsia="es-CL"/>
-              </w:rPr>
-              <w:t xml:space="preserve"> (</w:t>
-            </w:r>
-            <w:proofErr w:type="spellStart"/>
-            <w:r>
-              <w:rPr>
-                <w:rFonts w:ascii="Calibri" w:hAnsi="Calibri" w:cs="Arial"/>
-                <w:i/>
-                <w:color w:val="548DD4"/>
-                <w:sz w:val="20"/>
-                <w:szCs w:val="20"/>
-                <w:lang w:eastAsia="es-CL"/>
-              </w:rPr>
-              <w:t>docs</w:t>
-            </w:r>
-            <w:proofErr w:type="spellEnd"/>
-            <w:r>
-              <w:rPr>
-                <w:rFonts w:ascii="Calibri" w:hAnsi="Calibri" w:cs="Arial"/>
-                <w:i/>
-                <w:color w:val="548DD4"/>
-                <w:sz w:val="20"/>
-                <w:szCs w:val="20"/>
-                <w:lang w:eastAsia="es-CL"/>
-              </w:rPr>
-              <w:t>/</w:t>
-            </w:r>
-            <w:proofErr w:type="spellStart"/>
-            <w:r>
-              <w:rPr>
-                <w:rFonts w:ascii="Calibri" w:hAnsi="Calibri" w:cs="Arial"/>
-                <w:i/>
-                <w:color w:val="548DD4"/>
-                <w:sz w:val="20"/>
-                <w:szCs w:val="20"/>
-                <w:lang w:eastAsia="es-CL"/>
-              </w:rPr>
-              <w:t>scraping</w:t>
-            </w:r>
-            <w:proofErr w:type="spellEnd"/>
-            <w:r>
-              <w:rPr>
-                <w:rFonts w:ascii="Calibri" w:hAnsi="Calibri" w:cs="Arial"/>
-                <w:i/>
-                <w:color w:val="548DD4"/>
-                <w:sz w:val="20"/>
-                <w:szCs w:val="20"/>
-                <w:lang w:eastAsia="es-CL"/>
-              </w:rPr>
-              <w:t>/maicao-poc.md). Estas evidencias dan cuenta de la factibilidad técnica en la recolección y estructuración de datos de perfumería. La calidad del proyecto se resguardó mediante la documentación de inconsistencias de datos (known_data_issues.md) y el uso de colas de revisión manual, asegurando que los registros sean fiables antes de ser procesados por la IA.</w:t>
+              <w:t>) para asegurar datos fiables antes del consumo por parte del módulo de IA.</w:t>
             </w:r>
           </w:p>
         </w:tc>
@@ -1243,703 +1559,6 @@
         </w:rPr>
       </w:pPr>
     </w:p>
-    <w:tbl>
-      <w:tblPr>
-        <w:tblStyle w:val="Tablaconcuadrcula"/>
-        <w:tblpPr w:leftFromText="180" w:rightFromText="180" w:vertAnchor="page" w:horzAnchor="margin" w:tblpXSpec="center" w:tblpY="3517"/>
-        <w:tblW w:w="9776" w:type="dxa"/>
-        <w:tblBorders>
-          <w:top w:val="single" w:sz="4" w:space="0" w:color="BFBFBF" w:themeColor="background1" w:themeShade="BF"/>
-          <w:left w:val="single" w:sz="4" w:space="0" w:color="BFBFBF" w:themeColor="background1" w:themeShade="BF"/>
-          <w:bottom w:val="single" w:sz="4" w:space="0" w:color="BFBFBF" w:themeColor="background1" w:themeShade="BF"/>
-          <w:right w:val="single" w:sz="4" w:space="0" w:color="BFBFBF" w:themeColor="background1" w:themeShade="BF"/>
-          <w:insideH w:val="single" w:sz="4" w:space="0" w:color="BFBFBF" w:themeColor="background1" w:themeShade="BF"/>
-          <w:insideV w:val="single" w:sz="4" w:space="0" w:color="BFBFBF" w:themeColor="background1" w:themeShade="BF"/>
-        </w:tblBorders>
-        <w:tblLayout w:type="fixed"/>
-        <w:tblLook w:val="04A0" w:firstRow="1" w:lastRow="0" w:firstColumn="1" w:lastColumn="0" w:noHBand="0" w:noVBand="1"/>
-      </w:tblPr>
-      <w:tblGrid>
-        <w:gridCol w:w="1328"/>
-        <w:gridCol w:w="1077"/>
-        <w:gridCol w:w="1276"/>
-        <w:gridCol w:w="1276"/>
-        <w:gridCol w:w="1275"/>
-        <w:gridCol w:w="1276"/>
-        <w:gridCol w:w="1418"/>
-        <w:gridCol w:w="850"/>
-      </w:tblGrid>
-      <w:tr>
-        <w:trPr>
-          <w:trHeight w:val="415"/>
-        </w:trPr>
-        <w:tc>
-          <w:tcPr>
-            <w:tcW w:w="9776" w:type="dxa"/>
-            <w:gridSpan w:val="8"/>
-            <w:vAlign w:val="center"/>
-          </w:tcPr>
-          <w:p>
-            <w:pPr>
-              <w:jc w:val="center"/>
-              <w:rPr>
-                <w:rFonts w:ascii="Calibri" w:hAnsi="Calibri"/>
-                <w:color w:val="1F3864" w:themeColor="accent1" w:themeShade="80"/>
-                <w:sz w:val="18"/>
-              </w:rPr>
-            </w:pPr>
-            <w:r>
-              <w:rPr>
-                <w:rFonts w:ascii="Calibri" w:hAnsi="Calibri"/>
-                <w:color w:val="1F3864" w:themeColor="accent1" w:themeShade="80"/>
-                <w:sz w:val="18"/>
-              </w:rPr>
-              <w:lastRenderedPageBreak/>
-              <w:t>Plan de Trabajo</w:t>
-            </w:r>
-          </w:p>
-        </w:tc>
-      </w:tr>
-      <w:tr>
-        <w:trPr>
-          <w:trHeight w:val="711"/>
-        </w:trPr>
-        <w:tc>
-          <w:tcPr>
-            <w:tcW w:w="1328" w:type="dxa"/>
-            <w:vAlign w:val="center"/>
-          </w:tcPr>
-          <w:p>
-            <w:pPr>
-              <w:jc w:val="center"/>
-              <w:rPr>
-                <w:rFonts w:ascii="Calibri" w:hAnsi="Calibri"/>
-                <w:color w:val="1F3864" w:themeColor="accent1" w:themeShade="80"/>
-                <w:sz w:val="18"/>
-              </w:rPr>
-            </w:pPr>
-            <w:r>
-              <w:rPr>
-                <w:rFonts w:ascii="Calibri" w:hAnsi="Calibri"/>
-                <w:color w:val="1F3864" w:themeColor="accent1" w:themeShade="80"/>
-                <w:sz w:val="18"/>
-              </w:rPr>
-              <w:t>C</w:t>
-            </w:r>
-            <w:r>
-              <w:rPr>
-                <w:rFonts w:ascii="Calibri" w:hAnsi="Calibri"/>
-                <w:color w:val="1F3864" w:themeColor="accent1" w:themeShade="80"/>
-                <w:sz w:val="18"/>
-              </w:rPr>
-              <w:t>ompetencia</w:t>
-            </w:r>
-            <w:r>
-              <w:rPr>
-                <w:rFonts w:ascii="Calibri" w:hAnsi="Calibri"/>
-                <w:color w:val="1F3864" w:themeColor="accent1" w:themeShade="80"/>
-                <w:sz w:val="18"/>
-              </w:rPr>
-              <w:t xml:space="preserve"> o unidades de competencias</w:t>
-            </w:r>
-          </w:p>
-        </w:tc>
-        <w:tc>
-          <w:tcPr>
-            <w:tcW w:w="1077" w:type="dxa"/>
-            <w:vAlign w:val="center"/>
-          </w:tcPr>
-          <w:p>
-            <w:pPr>
-              <w:jc w:val="center"/>
-              <w:rPr>
-                <w:rFonts w:ascii="Calibri" w:hAnsi="Calibri"/>
-                <w:color w:val="1F3864" w:themeColor="accent1" w:themeShade="80"/>
-                <w:sz w:val="18"/>
-              </w:rPr>
-            </w:pPr>
-            <w:r>
-              <w:rPr>
-                <w:rFonts w:ascii="Calibri" w:hAnsi="Calibri"/>
-                <w:color w:val="1F3864" w:themeColor="accent1" w:themeShade="80"/>
-                <w:sz w:val="18"/>
-              </w:rPr>
-              <w:t>Actividades</w:t>
-            </w:r>
-          </w:p>
-        </w:tc>
-        <w:tc>
-          <w:tcPr>
-            <w:tcW w:w="1276" w:type="dxa"/>
-            <w:vAlign w:val="center"/>
-          </w:tcPr>
-          <w:p>
-            <w:pPr>
-              <w:jc w:val="center"/>
-              <w:rPr>
-                <w:rFonts w:ascii="Calibri" w:hAnsi="Calibri"/>
-                <w:color w:val="1F3864" w:themeColor="accent1" w:themeShade="80"/>
-                <w:sz w:val="18"/>
-              </w:rPr>
-            </w:pPr>
-            <w:r>
-              <w:rPr>
-                <w:rFonts w:ascii="Calibri" w:hAnsi="Calibri"/>
-                <w:color w:val="1F3864" w:themeColor="accent1" w:themeShade="80"/>
-                <w:sz w:val="18"/>
-              </w:rPr>
-              <w:t>Recursos</w:t>
-            </w:r>
-          </w:p>
-        </w:tc>
-        <w:tc>
-          <w:tcPr>
-            <w:tcW w:w="1276" w:type="dxa"/>
-            <w:vAlign w:val="center"/>
-          </w:tcPr>
-          <w:p>
-            <w:pPr>
-              <w:jc w:val="center"/>
-              <w:rPr>
-                <w:rFonts w:ascii="Calibri" w:hAnsi="Calibri"/>
-                <w:color w:val="1F3864" w:themeColor="accent1" w:themeShade="80"/>
-                <w:sz w:val="18"/>
-              </w:rPr>
-            </w:pPr>
-            <w:r>
-              <w:rPr>
-                <w:rFonts w:ascii="Calibri" w:hAnsi="Calibri"/>
-                <w:color w:val="1F3864" w:themeColor="accent1" w:themeShade="80"/>
-                <w:sz w:val="18"/>
-              </w:rPr>
-              <w:t>Duración de la actividad</w:t>
-            </w:r>
-          </w:p>
-        </w:tc>
-        <w:tc>
-          <w:tcPr>
-            <w:tcW w:w="1275" w:type="dxa"/>
-            <w:vAlign w:val="center"/>
-          </w:tcPr>
-          <w:p>
-            <w:pPr>
-              <w:jc w:val="center"/>
-              <w:rPr>
-                <w:rFonts w:ascii="Calibri" w:hAnsi="Calibri"/>
-                <w:color w:val="1F3864" w:themeColor="accent1" w:themeShade="80"/>
-                <w:sz w:val="18"/>
-              </w:rPr>
-            </w:pPr>
-            <w:r>
-              <w:rPr>
-                <w:rFonts w:ascii="Calibri" w:hAnsi="Calibri"/>
-                <w:color w:val="1F3864" w:themeColor="accent1" w:themeShade="80"/>
-                <w:sz w:val="18"/>
-              </w:rPr>
-              <w:t>Responsable</w:t>
-            </w:r>
-            <w:r>
-              <w:rPr>
-                <w:rStyle w:val="Refdenotaalpie"/>
-                <w:rFonts w:ascii="Calibri" w:hAnsi="Calibri"/>
-                <w:color w:val="1F3864" w:themeColor="accent1" w:themeShade="80"/>
-                <w:sz w:val="18"/>
-              </w:rPr>
-              <w:footnoteReference w:id="1"/>
-            </w:r>
-          </w:p>
-        </w:tc>
-        <w:tc>
-          <w:tcPr>
-            <w:tcW w:w="1276" w:type="dxa"/>
-            <w:vAlign w:val="center"/>
-          </w:tcPr>
-          <w:p>
-            <w:pPr>
-              <w:jc w:val="center"/>
-              <w:rPr>
-                <w:rFonts w:ascii="Calibri" w:hAnsi="Calibri"/>
-                <w:color w:val="1F3864" w:themeColor="accent1" w:themeShade="80"/>
-                <w:sz w:val="18"/>
-              </w:rPr>
-            </w:pPr>
-            <w:r>
-              <w:rPr>
-                <w:rFonts w:ascii="Calibri" w:hAnsi="Calibri"/>
-                <w:color w:val="1F3864" w:themeColor="accent1" w:themeShade="80"/>
-                <w:sz w:val="18"/>
-              </w:rPr>
-              <w:t>Observaciones</w:t>
-            </w:r>
-          </w:p>
-        </w:tc>
-        <w:tc>
-          <w:tcPr>
-            <w:tcW w:w="1418" w:type="dxa"/>
-            <w:vAlign w:val="center"/>
-          </w:tcPr>
-          <w:p>
-            <w:pPr>
-              <w:jc w:val="center"/>
-              <w:rPr>
-                <w:rFonts w:ascii="Calibri" w:hAnsi="Calibri"/>
-                <w:color w:val="1F3864" w:themeColor="accent1" w:themeShade="80"/>
-                <w:sz w:val="18"/>
-              </w:rPr>
-            </w:pPr>
-            <w:r>
-              <w:rPr>
-                <w:rFonts w:ascii="Calibri" w:hAnsi="Calibri"/>
-                <w:color w:val="1F3864" w:themeColor="accent1" w:themeShade="80"/>
-                <w:sz w:val="18"/>
-              </w:rPr>
-              <w:t>Estado de avance</w:t>
-            </w:r>
-          </w:p>
-        </w:tc>
-        <w:tc>
-          <w:tcPr>
-            <w:tcW w:w="850" w:type="dxa"/>
-            <w:vAlign w:val="center"/>
-          </w:tcPr>
-          <w:p>
-            <w:pPr>
-              <w:jc w:val="center"/>
-              <w:rPr>
-                <w:rFonts w:ascii="Calibri" w:hAnsi="Calibri"/>
-                <w:color w:val="1F3864" w:themeColor="accent1" w:themeShade="80"/>
-                <w:sz w:val="18"/>
-              </w:rPr>
-            </w:pPr>
-            <w:r>
-              <w:rPr>
-                <w:rFonts w:ascii="Calibri" w:hAnsi="Calibri"/>
-                <w:color w:val="1F3864" w:themeColor="accent1" w:themeShade="80"/>
-                <w:sz w:val="18"/>
-              </w:rPr>
-              <w:t>A</w:t>
-            </w:r>
-            <w:r>
-              <w:rPr>
-                <w:rFonts w:ascii="Calibri" w:hAnsi="Calibri"/>
-                <w:color w:val="1F3864" w:themeColor="accent1" w:themeShade="80"/>
-                <w:sz w:val="18"/>
-              </w:rPr>
-              <w:t>justes</w:t>
-            </w:r>
-          </w:p>
-        </w:tc>
-      </w:tr>
-      <w:tr>
-        <w:trPr>
-          <w:trHeight w:val="2410"/>
-        </w:trPr>
-        <w:tc>
-          <w:tcPr>
-            <w:tcW w:w="1328" w:type="dxa"/>
-          </w:tcPr>
-          <w:p>
-            <w:pPr>
-              <w:jc w:val="both"/>
-              <w:rPr>
-                <w:b/>
-                <w:sz w:val="18"/>
-                <w:szCs w:val="24"/>
-              </w:rPr>
-            </w:pPr>
-            <w:r>
-              <w:t>&lt;</w:t>
-            </w:r>
-            <w:proofErr w:type="spellStart"/>
-            <w:r>
-              <w:t>zsdas</w:t>
-            </w:r>
-            <w:proofErr w:type="spellEnd"/>
-          </w:p>
-        </w:tc>
-        <w:tc>
-          <w:tcPr>
-            <w:tcW w:w="1077" w:type="dxa"/>
-          </w:tcPr>
-          <w:p>
-            <w:pPr>
-              <w:jc w:val="both"/>
-              <w:rPr>
-                <w:rFonts w:ascii="Calibri" w:hAnsi="Calibri" w:cs="Arial"/>
-                <w:i/>
-                <w:color w:val="548DD4"/>
-                <w:sz w:val="18"/>
-                <w:szCs w:val="20"/>
-                <w:lang w:eastAsia="es-CL"/>
-              </w:rPr>
-            </w:pPr>
-          </w:p>
-        </w:tc>
-        <w:tc>
-          <w:tcPr>
-            <w:tcW w:w="1276" w:type="dxa"/>
-          </w:tcPr>
-          <w:p>
-            <w:pPr>
-              <w:jc w:val="both"/>
-              <w:rPr>
-                <w:b/>
-                <w:sz w:val="18"/>
-                <w:szCs w:val="24"/>
-              </w:rPr>
-            </w:pPr>
-          </w:p>
-        </w:tc>
-        <w:tc>
-          <w:tcPr>
-            <w:tcW w:w="1276" w:type="dxa"/>
-          </w:tcPr>
-          <w:p>
-            <w:pPr>
-              <w:jc w:val="both"/>
-              <w:rPr>
-                <w:b/>
-                <w:sz w:val="18"/>
-                <w:szCs w:val="24"/>
-              </w:rPr>
-            </w:pPr>
-            <w:bookmarkStart w:id="0" w:name="_GoBack"/>
-            <w:bookmarkEnd w:id="0"/>
-          </w:p>
-        </w:tc>
-        <w:tc>
-          <w:tcPr>
-            <w:tcW w:w="1275" w:type="dxa"/>
-          </w:tcPr>
-          <w:p>
-            <w:pPr>
-              <w:jc w:val="both"/>
-              <w:rPr>
-                <w:rFonts w:ascii="Calibri" w:hAnsi="Calibri" w:cs="Arial"/>
-                <w:i/>
-                <w:color w:val="548DD4"/>
-                <w:sz w:val="18"/>
-                <w:szCs w:val="20"/>
-                <w:lang w:eastAsia="es-CL"/>
-              </w:rPr>
-            </w:pPr>
-            <w:r>
-              <w:rPr>
-                <w:rFonts w:ascii="Calibri" w:hAnsi="Calibri" w:cs="Arial"/>
-                <w:i/>
-                <w:color w:val="548DD4"/>
-                <w:sz w:val="18"/>
-                <w:szCs w:val="20"/>
-                <w:lang w:eastAsia="es-CL"/>
-              </w:rPr>
-              <w:t xml:space="preserve">Escribe el </w:t>
-            </w:r>
-            <w:r>
-              <w:rPr>
-                <w:rFonts w:ascii="Calibri" w:hAnsi="Calibri" w:cs="Arial"/>
-                <w:i/>
-                <w:color w:val="548DD4"/>
-                <w:sz w:val="18"/>
-                <w:szCs w:val="20"/>
-                <w:lang w:eastAsia="es-CL"/>
-              </w:rPr>
-              <w:t xml:space="preserve">nombre del integrante del equipo responsable de </w:t>
-            </w:r>
-            <w:r>
-              <w:rPr>
-                <w:rFonts w:ascii="Calibri" w:hAnsi="Calibri" w:cs="Arial"/>
-                <w:i/>
-                <w:color w:val="548DD4"/>
-                <w:sz w:val="18"/>
-                <w:szCs w:val="20"/>
-                <w:lang w:eastAsia="es-CL"/>
-              </w:rPr>
-              <w:t xml:space="preserve">cada </w:t>
-            </w:r>
-            <w:r>
-              <w:rPr>
-                <w:rFonts w:ascii="Calibri" w:hAnsi="Calibri" w:cs="Arial"/>
-                <w:i/>
-                <w:color w:val="548DD4"/>
-                <w:sz w:val="18"/>
-                <w:szCs w:val="20"/>
-                <w:lang w:eastAsia="es-CL"/>
-              </w:rPr>
-              <w:t>actividad.</w:t>
-            </w:r>
-          </w:p>
-        </w:tc>
-        <w:tc>
-          <w:tcPr>
-            <w:tcW w:w="1276" w:type="dxa"/>
-          </w:tcPr>
-          <w:p>
-            <w:pPr>
-              <w:jc w:val="both"/>
-              <w:rPr>
-                <w:rFonts w:ascii="Calibri" w:hAnsi="Calibri" w:cs="Arial"/>
-                <w:i/>
-                <w:color w:val="548DD4"/>
-                <w:sz w:val="18"/>
-                <w:szCs w:val="20"/>
-                <w:lang w:eastAsia="es-CL"/>
-              </w:rPr>
-            </w:pPr>
-            <w:r>
-              <w:rPr>
-                <w:rFonts w:ascii="Calibri" w:hAnsi="Calibri" w:cs="Arial"/>
-                <w:i/>
-                <w:color w:val="548DD4"/>
-                <w:sz w:val="18"/>
-                <w:szCs w:val="20"/>
-                <w:lang w:eastAsia="es-CL"/>
-              </w:rPr>
-              <w:t xml:space="preserve">Señala </w:t>
-            </w:r>
-            <w:r>
-              <w:rPr>
-                <w:rFonts w:ascii="Calibri" w:hAnsi="Calibri" w:cs="Arial"/>
-                <w:i/>
-                <w:color w:val="548DD4"/>
-                <w:sz w:val="18"/>
-                <w:szCs w:val="20"/>
-                <w:lang w:eastAsia="es-CL"/>
-              </w:rPr>
-              <w:t>las dific</w:t>
-            </w:r>
-            <w:r>
-              <w:rPr>
-                <w:rFonts w:ascii="Calibri" w:hAnsi="Calibri" w:cs="Arial"/>
-                <w:i/>
-                <w:color w:val="548DD4"/>
-                <w:sz w:val="18"/>
-                <w:szCs w:val="20"/>
-                <w:lang w:eastAsia="es-CL"/>
-              </w:rPr>
-              <w:t>ult</w:t>
-            </w:r>
-            <w:r>
-              <w:rPr>
-                <w:rFonts w:ascii="Calibri" w:hAnsi="Calibri" w:cs="Arial"/>
-                <w:i/>
-                <w:color w:val="548DD4"/>
-                <w:sz w:val="18"/>
-                <w:szCs w:val="20"/>
-                <w:lang w:eastAsia="es-CL"/>
-              </w:rPr>
-              <w:t>ades o facilitadores que se podrían presentar durante la ejecución de cada una de las actividades propuestas.</w:t>
-            </w:r>
-          </w:p>
-        </w:tc>
-        <w:tc>
-          <w:tcPr>
-            <w:tcW w:w="1418" w:type="dxa"/>
-          </w:tcPr>
-          <w:p>
-            <w:pPr>
-              <w:jc w:val="both"/>
-              <w:rPr>
-                <w:rFonts w:ascii="Calibri" w:hAnsi="Calibri" w:cs="Arial"/>
-                <w:i/>
-                <w:color w:val="548DD4"/>
-                <w:sz w:val="18"/>
-                <w:szCs w:val="20"/>
-                <w:lang w:eastAsia="es-CL"/>
-              </w:rPr>
-            </w:pPr>
-            <w:r>
-              <w:rPr>
-                <w:rFonts w:ascii="Calibri" w:hAnsi="Calibri" w:cs="Arial"/>
-                <w:i/>
-                <w:color w:val="548DD4"/>
-                <w:sz w:val="18"/>
-                <w:szCs w:val="20"/>
-                <w:lang w:eastAsia="es-CL"/>
-              </w:rPr>
-              <w:t>D</w:t>
-            </w:r>
-            <w:r>
-              <w:rPr>
-                <w:rFonts w:ascii="Calibri" w:hAnsi="Calibri" w:cs="Arial"/>
-                <w:i/>
-                <w:color w:val="548DD4"/>
-                <w:sz w:val="18"/>
-                <w:szCs w:val="20"/>
-                <w:lang w:eastAsia="es-CL"/>
-              </w:rPr>
-              <w:t>escribe</w:t>
-            </w:r>
-            <w:r>
-              <w:rPr>
-                <w:rFonts w:ascii="Calibri" w:hAnsi="Calibri" w:cs="Arial"/>
-                <w:i/>
-                <w:color w:val="548DD4"/>
-                <w:sz w:val="18"/>
-                <w:szCs w:val="20"/>
-                <w:lang w:eastAsia="es-CL"/>
-              </w:rPr>
-              <w:t xml:space="preserve"> el estado de avance </w:t>
-            </w:r>
-            <w:r>
-              <w:rPr>
-                <w:rFonts w:ascii="Calibri" w:hAnsi="Calibri" w:cs="Arial"/>
-                <w:i/>
-                <w:color w:val="548DD4"/>
-                <w:sz w:val="18"/>
-                <w:szCs w:val="20"/>
-                <w:lang w:eastAsia="es-CL"/>
-              </w:rPr>
-              <w:t>de cada actividad.</w:t>
-            </w:r>
-          </w:p>
-          <w:p>
-            <w:pPr>
-              <w:jc w:val="both"/>
-              <w:rPr>
-                <w:rFonts w:ascii="Calibri" w:hAnsi="Calibri" w:cs="Arial"/>
-                <w:i/>
-                <w:color w:val="C00000"/>
-                <w:sz w:val="16"/>
-                <w:szCs w:val="20"/>
-                <w:lang w:eastAsia="es-CL"/>
-              </w:rPr>
-            </w:pPr>
-          </w:p>
-          <w:p>
-            <w:pPr>
-              <w:jc w:val="both"/>
-              <w:rPr>
-                <w:rFonts w:ascii="Calibri" w:hAnsi="Calibri" w:cs="Arial"/>
-                <w:i/>
-                <w:color w:val="548DD4"/>
-                <w:sz w:val="18"/>
-                <w:szCs w:val="20"/>
-                <w:lang w:eastAsia="es-CL"/>
-              </w:rPr>
-            </w:pPr>
-            <w:r>
-              <w:rPr>
-                <w:rFonts w:ascii="Calibri" w:hAnsi="Calibri" w:cs="Arial"/>
-                <w:i/>
-                <w:color w:val="548DD4"/>
-                <w:sz w:val="18"/>
-                <w:szCs w:val="20"/>
-                <w:lang w:eastAsia="es-CL"/>
-              </w:rPr>
-              <w:t xml:space="preserve">Tipos de estado: </w:t>
-            </w:r>
-          </w:p>
-          <w:p>
-            <w:pPr>
-              <w:jc w:val="both"/>
-              <w:rPr>
-                <w:rFonts w:ascii="Calibri" w:hAnsi="Calibri" w:cs="Arial"/>
-                <w:i/>
-                <w:color w:val="C00000"/>
-                <w:sz w:val="16"/>
-                <w:szCs w:val="20"/>
-                <w:lang w:eastAsia="es-CL"/>
-              </w:rPr>
-            </w:pPr>
-            <w:r>
-              <w:rPr>
-                <w:rFonts w:ascii="Calibri" w:hAnsi="Calibri" w:cs="Arial"/>
-                <w:i/>
-                <w:color w:val="548DD4"/>
-                <w:sz w:val="18"/>
-                <w:szCs w:val="20"/>
-                <w:lang w:eastAsia="es-CL"/>
-              </w:rPr>
-              <w:t>En curso/ Con retraso/ No iniciado/ Completado/ Ajustada</w:t>
-            </w:r>
-            <w:r>
-              <w:rPr>
-                <w:rFonts w:ascii="Calibri" w:hAnsi="Calibri" w:cs="Arial"/>
-                <w:i/>
-                <w:color w:val="C00000"/>
-                <w:sz w:val="16"/>
-                <w:szCs w:val="20"/>
-                <w:lang w:eastAsia="es-CL"/>
-              </w:rPr>
-              <w:t xml:space="preserve"> </w:t>
-            </w:r>
-          </w:p>
-        </w:tc>
-        <w:tc>
-          <w:tcPr>
-            <w:tcW w:w="850" w:type="dxa"/>
-          </w:tcPr>
-          <w:p>
-            <w:pPr>
-              <w:jc w:val="both"/>
-              <w:rPr>
-                <w:rFonts w:ascii="Calibri" w:hAnsi="Calibri" w:cs="Arial"/>
-                <w:i/>
-                <w:color w:val="548DD4"/>
-                <w:sz w:val="18"/>
-                <w:szCs w:val="20"/>
-                <w:lang w:eastAsia="es-CL"/>
-              </w:rPr>
-            </w:pPr>
-            <w:r>
-              <w:rPr>
-                <w:rFonts w:ascii="Calibri" w:hAnsi="Calibri" w:cs="Arial"/>
-                <w:i/>
-                <w:color w:val="548DD4"/>
-                <w:sz w:val="18"/>
-                <w:szCs w:val="20"/>
-                <w:lang w:eastAsia="es-CL"/>
-              </w:rPr>
-              <w:t>S</w:t>
-            </w:r>
-            <w:r>
-              <w:rPr>
-                <w:rFonts w:ascii="Calibri" w:hAnsi="Calibri" w:cs="Arial"/>
-                <w:i/>
-                <w:color w:val="548DD4"/>
-                <w:sz w:val="18"/>
-                <w:szCs w:val="20"/>
-                <w:lang w:eastAsia="es-CL"/>
-              </w:rPr>
-              <w:t>e</w:t>
-            </w:r>
-            <w:r>
-              <w:rPr>
-                <w:rFonts w:ascii="Calibri" w:hAnsi="Calibri" w:cs="Arial"/>
-                <w:i/>
-                <w:color w:val="548DD4"/>
-                <w:sz w:val="18"/>
-                <w:szCs w:val="20"/>
-                <w:lang w:eastAsia="es-CL"/>
-              </w:rPr>
-              <w:t xml:space="preserve">ñala los ajustes o reformulaciones </w:t>
-            </w:r>
-            <w:r>
-              <w:rPr>
-                <w:rFonts w:ascii="Calibri" w:hAnsi="Calibri" w:cs="Arial"/>
-                <w:i/>
-                <w:color w:val="548DD4"/>
-                <w:sz w:val="18"/>
-                <w:szCs w:val="20"/>
-                <w:lang w:eastAsia="es-CL"/>
-              </w:rPr>
-              <w:t>que has realiza</w:t>
-            </w:r>
-            <w:r>
-              <w:rPr>
-                <w:rFonts w:ascii="Calibri" w:hAnsi="Calibri" w:cs="Arial"/>
-                <w:i/>
-                <w:color w:val="548DD4"/>
-                <w:sz w:val="18"/>
-                <w:szCs w:val="20"/>
-                <w:lang w:eastAsia="es-CL"/>
-              </w:rPr>
-              <w:t xml:space="preserve">do. </w:t>
-            </w:r>
-          </w:p>
-        </w:tc>
-      </w:tr>
-    </w:tbl>
     <w:p>
       <w:pPr>
         <w:rPr>
@@ -2093,6 +1712,1504 @@
               </w:rPr>
               <w:t xml:space="preserve"> los obstáculos. Por último, señala los ajustes que realizaste al plan de trabajo a partir de este análisis.</w:t>
             </w:r>
+          </w:p>
+        </w:tc>
+      </w:tr>
+    </w:tbl>
+    <w:tbl>
+      <w:tblPr>
+        <w:tblStyle w:val="Tablaconcuadrcula"/>
+        <w:tblpPr w:leftFromText="180" w:rightFromText="180" w:vertAnchor="page" w:horzAnchor="margin" w:tblpXSpec="center" w:tblpY="3076"/>
+        <w:tblW w:w="10485" w:type="dxa"/>
+        <w:tblBorders>
+          <w:top w:val="single" w:sz="4" w:space="0" w:color="BFBFBF" w:themeColor="background1" w:themeShade="BF"/>
+          <w:left w:val="single" w:sz="4" w:space="0" w:color="BFBFBF" w:themeColor="background1" w:themeShade="BF"/>
+          <w:bottom w:val="single" w:sz="4" w:space="0" w:color="BFBFBF" w:themeColor="background1" w:themeShade="BF"/>
+          <w:right w:val="single" w:sz="4" w:space="0" w:color="BFBFBF" w:themeColor="background1" w:themeShade="BF"/>
+          <w:insideH w:val="single" w:sz="4" w:space="0" w:color="BFBFBF" w:themeColor="background1" w:themeShade="BF"/>
+          <w:insideV w:val="single" w:sz="4" w:space="0" w:color="BFBFBF" w:themeColor="background1" w:themeShade="BF"/>
+        </w:tblBorders>
+        <w:tblLayout w:type="fixed"/>
+        <w:tblLook w:val="04A0" w:firstRow="1" w:lastRow="0" w:firstColumn="1" w:lastColumn="0" w:noHBand="0" w:noVBand="1"/>
+      </w:tblPr>
+      <w:tblGrid>
+        <w:gridCol w:w="1338"/>
+        <w:gridCol w:w="1085"/>
+        <w:gridCol w:w="1285"/>
+        <w:gridCol w:w="1285"/>
+        <w:gridCol w:w="1284"/>
+        <w:gridCol w:w="1285"/>
+        <w:gridCol w:w="1428"/>
+        <w:gridCol w:w="1495"/>
+      </w:tblGrid>
+      <w:tr>
+        <w:trPr>
+          <w:trHeight w:val="213"/>
+        </w:trPr>
+        <w:tc>
+          <w:tcPr>
+            <w:tcW w:w="10485" w:type="dxa"/>
+            <w:gridSpan w:val="8"/>
+            <w:vAlign w:val="center"/>
+          </w:tcPr>
+          <w:p>
+            <w:pPr>
+              <w:jc w:val="center"/>
+              <w:rPr>
+                <w:rFonts w:ascii="Calibri" w:hAnsi="Calibri"/>
+                <w:color w:val="1F3864" w:themeColor="accent1" w:themeShade="80"/>
+                <w:sz w:val="18"/>
+              </w:rPr>
+            </w:pPr>
+            <w:r>
+              <w:rPr>
+                <w:rFonts w:ascii="Calibri" w:hAnsi="Calibri"/>
+                <w:color w:val="1F3864" w:themeColor="accent1" w:themeShade="80"/>
+                <w:sz w:val="18"/>
+              </w:rPr>
+              <w:t>Plan de Trabajo</w:t>
+            </w:r>
+          </w:p>
+        </w:tc>
+      </w:tr>
+      <w:tr>
+        <w:trPr>
+          <w:trHeight w:val="366"/>
+        </w:trPr>
+        <w:tc>
+          <w:tcPr>
+            <w:tcW w:w="1338" w:type="dxa"/>
+            <w:vAlign w:val="center"/>
+          </w:tcPr>
+          <w:p>
+            <w:pPr>
+              <w:jc w:val="center"/>
+              <w:rPr>
+                <w:rFonts w:ascii="Calibri" w:hAnsi="Calibri"/>
+                <w:color w:val="1F3864" w:themeColor="accent1" w:themeShade="80"/>
+                <w:sz w:val="18"/>
+              </w:rPr>
+            </w:pPr>
+            <w:r>
+              <w:rPr>
+                <w:rFonts w:ascii="Calibri" w:hAnsi="Calibri"/>
+                <w:color w:val="1F3864" w:themeColor="accent1" w:themeShade="80"/>
+                <w:sz w:val="18"/>
+              </w:rPr>
+              <w:t>C</w:t>
+            </w:r>
+            <w:r>
+              <w:rPr>
+                <w:rFonts w:ascii="Calibri" w:hAnsi="Calibri"/>
+                <w:color w:val="1F3864" w:themeColor="accent1" w:themeShade="80"/>
+                <w:sz w:val="18"/>
+              </w:rPr>
+              <w:t>ompetencia</w:t>
+            </w:r>
+            <w:r>
+              <w:rPr>
+                <w:rFonts w:ascii="Calibri" w:hAnsi="Calibri"/>
+                <w:color w:val="1F3864" w:themeColor="accent1" w:themeShade="80"/>
+                <w:sz w:val="18"/>
+              </w:rPr>
+              <w:t xml:space="preserve"> o unidades de competencias</w:t>
+            </w:r>
+          </w:p>
+        </w:tc>
+        <w:tc>
+          <w:tcPr>
+            <w:tcW w:w="1085" w:type="dxa"/>
+            <w:vAlign w:val="center"/>
+          </w:tcPr>
+          <w:p>
+            <w:pPr>
+              <w:jc w:val="center"/>
+              <w:rPr>
+                <w:rFonts w:ascii="Calibri" w:hAnsi="Calibri"/>
+                <w:color w:val="1F3864" w:themeColor="accent1" w:themeShade="80"/>
+                <w:sz w:val="18"/>
+              </w:rPr>
+            </w:pPr>
+            <w:r>
+              <w:rPr>
+                <w:rFonts w:ascii="Calibri" w:hAnsi="Calibri"/>
+                <w:color w:val="1F3864" w:themeColor="accent1" w:themeShade="80"/>
+                <w:sz w:val="18"/>
+              </w:rPr>
+              <w:t>Actividades</w:t>
+            </w:r>
+          </w:p>
+        </w:tc>
+        <w:tc>
+          <w:tcPr>
+            <w:tcW w:w="1285" w:type="dxa"/>
+            <w:vAlign w:val="center"/>
+          </w:tcPr>
+          <w:p>
+            <w:pPr>
+              <w:jc w:val="center"/>
+              <w:rPr>
+                <w:rFonts w:ascii="Calibri" w:hAnsi="Calibri"/>
+                <w:color w:val="1F3864" w:themeColor="accent1" w:themeShade="80"/>
+                <w:sz w:val="18"/>
+              </w:rPr>
+            </w:pPr>
+            <w:r>
+              <w:rPr>
+                <w:rFonts w:ascii="Calibri" w:hAnsi="Calibri"/>
+                <w:color w:val="1F3864" w:themeColor="accent1" w:themeShade="80"/>
+                <w:sz w:val="18"/>
+              </w:rPr>
+              <w:t>Recursos</w:t>
+            </w:r>
+          </w:p>
+        </w:tc>
+        <w:tc>
+          <w:tcPr>
+            <w:tcW w:w="1285" w:type="dxa"/>
+            <w:vAlign w:val="center"/>
+          </w:tcPr>
+          <w:p>
+            <w:pPr>
+              <w:jc w:val="center"/>
+              <w:rPr>
+                <w:rFonts w:ascii="Calibri" w:hAnsi="Calibri"/>
+                <w:color w:val="1F3864" w:themeColor="accent1" w:themeShade="80"/>
+                <w:sz w:val="18"/>
+              </w:rPr>
+            </w:pPr>
+            <w:r>
+              <w:rPr>
+                <w:rFonts w:ascii="Calibri" w:hAnsi="Calibri"/>
+                <w:color w:val="1F3864" w:themeColor="accent1" w:themeShade="80"/>
+                <w:sz w:val="18"/>
+              </w:rPr>
+              <w:t>Duración de la actividad</w:t>
+            </w:r>
+          </w:p>
+        </w:tc>
+        <w:tc>
+          <w:tcPr>
+            <w:tcW w:w="1284" w:type="dxa"/>
+            <w:vAlign w:val="center"/>
+          </w:tcPr>
+          <w:p>
+            <w:pPr>
+              <w:jc w:val="center"/>
+              <w:rPr>
+                <w:rFonts w:ascii="Calibri" w:hAnsi="Calibri"/>
+                <w:color w:val="1F3864" w:themeColor="accent1" w:themeShade="80"/>
+                <w:sz w:val="18"/>
+              </w:rPr>
+            </w:pPr>
+            <w:r>
+              <w:rPr>
+                <w:rFonts w:ascii="Calibri" w:hAnsi="Calibri"/>
+                <w:color w:val="1F3864" w:themeColor="accent1" w:themeShade="80"/>
+                <w:sz w:val="18"/>
+              </w:rPr>
+              <w:t>Responsable</w:t>
+            </w:r>
+            <w:r>
+              <w:rPr>
+                <w:rStyle w:val="Refdenotaalpie"/>
+                <w:rFonts w:ascii="Calibri" w:hAnsi="Calibri"/>
+                <w:color w:val="1F3864" w:themeColor="accent1" w:themeShade="80"/>
+                <w:sz w:val="18"/>
+              </w:rPr>
+              <w:footnoteReference w:id="1"/>
+            </w:r>
+          </w:p>
+        </w:tc>
+        <w:tc>
+          <w:tcPr>
+            <w:tcW w:w="1285" w:type="dxa"/>
+            <w:vAlign w:val="center"/>
+          </w:tcPr>
+          <w:p>
+            <w:pPr>
+              <w:jc w:val="center"/>
+              <w:rPr>
+                <w:rFonts w:ascii="Calibri" w:hAnsi="Calibri"/>
+                <w:color w:val="1F3864" w:themeColor="accent1" w:themeShade="80"/>
+                <w:sz w:val="18"/>
+              </w:rPr>
+            </w:pPr>
+            <w:r>
+              <w:rPr>
+                <w:rFonts w:ascii="Calibri" w:hAnsi="Calibri"/>
+                <w:color w:val="1F3864" w:themeColor="accent1" w:themeShade="80"/>
+                <w:sz w:val="18"/>
+              </w:rPr>
+              <w:t>Observaciones</w:t>
+            </w:r>
+          </w:p>
+        </w:tc>
+        <w:tc>
+          <w:tcPr>
+            <w:tcW w:w="1428" w:type="dxa"/>
+            <w:vAlign w:val="center"/>
+          </w:tcPr>
+          <w:p>
+            <w:pPr>
+              <w:jc w:val="center"/>
+              <w:rPr>
+                <w:rFonts w:ascii="Calibri" w:hAnsi="Calibri"/>
+                <w:color w:val="1F3864" w:themeColor="accent1" w:themeShade="80"/>
+                <w:sz w:val="18"/>
+              </w:rPr>
+            </w:pPr>
+            <w:r>
+              <w:rPr>
+                <w:rFonts w:ascii="Calibri" w:hAnsi="Calibri"/>
+                <w:color w:val="1F3864" w:themeColor="accent1" w:themeShade="80"/>
+                <w:sz w:val="18"/>
+              </w:rPr>
+              <w:t>Estado de avance</w:t>
+            </w:r>
+          </w:p>
+        </w:tc>
+        <w:tc>
+          <w:tcPr>
+            <w:tcW w:w="1495" w:type="dxa"/>
+            <w:vAlign w:val="center"/>
+          </w:tcPr>
+          <w:p>
+            <w:pPr>
+              <w:jc w:val="center"/>
+              <w:rPr>
+                <w:rFonts w:ascii="Calibri" w:hAnsi="Calibri"/>
+                <w:color w:val="1F3864" w:themeColor="accent1" w:themeShade="80"/>
+                <w:sz w:val="18"/>
+              </w:rPr>
+            </w:pPr>
+            <w:r>
+              <w:rPr>
+                <w:rFonts w:ascii="Calibri" w:hAnsi="Calibri"/>
+                <w:color w:val="1F3864" w:themeColor="accent1" w:themeShade="80"/>
+                <w:sz w:val="18"/>
+              </w:rPr>
+              <w:t>A</w:t>
+            </w:r>
+            <w:r>
+              <w:rPr>
+                <w:rFonts w:ascii="Calibri" w:hAnsi="Calibri"/>
+                <w:color w:val="1F3864" w:themeColor="accent1" w:themeShade="80"/>
+                <w:sz w:val="18"/>
+              </w:rPr>
+              <w:t>justes</w:t>
+            </w:r>
+          </w:p>
+        </w:tc>
+      </w:tr>
+      <w:tr>
+        <w:trPr>
+          <w:trHeight w:val="1241"/>
+        </w:trPr>
+        <w:tc>
+          <w:tcPr>
+            <w:tcW w:w="1338" w:type="dxa"/>
+          </w:tcPr>
+          <w:p>
+            <w:pPr>
+              <w:jc w:val="both"/>
+            </w:pPr>
+            <w:r>
+              <w:t>Ingeniería de Requisitos / Gestión</w:t>
+            </w:r>
+          </w:p>
+        </w:tc>
+        <w:tc>
+          <w:tcPr>
+            <w:tcW w:w="1085" w:type="dxa"/>
+          </w:tcPr>
+          <w:p>
+            <w:pPr>
+              <w:jc w:val="both"/>
+              <w:rPr>
+                <w:rFonts w:ascii="Calibri" w:hAnsi="Calibri" w:cs="Arial"/>
+                <w:i/>
+                <w:color w:val="548DD4"/>
+                <w:sz w:val="18"/>
+                <w:szCs w:val="20"/>
+                <w:lang w:eastAsia="es-CL"/>
+              </w:rPr>
+            </w:pPr>
+            <w:r>
+              <w:rPr>
+                <w:rFonts w:ascii="Calibri" w:hAnsi="Calibri" w:cs="Arial"/>
+                <w:i/>
+                <w:color w:val="548DD4"/>
+                <w:sz w:val="18"/>
+                <w:szCs w:val="20"/>
+                <w:lang w:eastAsia="es-CL"/>
+              </w:rPr>
+              <w:t>Gestión</w:t>
+            </w:r>
+            <w:r>
+              <w:rPr>
+                <w:rFonts w:ascii="Calibri" w:hAnsi="Calibri" w:cs="Arial"/>
+                <w:i/>
+                <w:color w:val="548DD4"/>
+                <w:sz w:val="18"/>
+                <w:szCs w:val="20"/>
+                <w:lang w:eastAsia="es-CL"/>
+              </w:rPr>
+              <w:tab/>
+              <w:t>1. Iniciación y Levantamiento de Requisitos</w:t>
+            </w:r>
+          </w:p>
+        </w:tc>
+        <w:tc>
+          <w:tcPr>
+            <w:tcW w:w="1285" w:type="dxa"/>
+          </w:tcPr>
+          <w:p>
+            <w:pPr>
+              <w:jc w:val="both"/>
+              <w:rPr>
+                <w:b/>
+                <w:sz w:val="18"/>
+                <w:szCs w:val="24"/>
+              </w:rPr>
+            </w:pPr>
+            <w:r>
+              <w:rPr>
+                <w:b/>
+                <w:sz w:val="18"/>
+                <w:szCs w:val="24"/>
+              </w:rPr>
+              <w:t xml:space="preserve">Jira, </w:t>
+            </w:r>
+            <w:proofErr w:type="spellStart"/>
+            <w:r>
+              <w:rPr>
+                <w:b/>
+                <w:sz w:val="18"/>
+                <w:szCs w:val="24"/>
+              </w:rPr>
+              <w:t>Confluence</w:t>
+            </w:r>
+            <w:proofErr w:type="spellEnd"/>
+            <w:r>
+              <w:rPr>
+                <w:b/>
+                <w:sz w:val="18"/>
+                <w:szCs w:val="24"/>
+              </w:rPr>
+              <w:t xml:space="preserve">, </w:t>
+            </w:r>
+            <w:proofErr w:type="spellStart"/>
+            <w:r>
+              <w:rPr>
+                <w:b/>
+                <w:sz w:val="18"/>
+                <w:szCs w:val="24"/>
+              </w:rPr>
+              <w:t>Figma</w:t>
+            </w:r>
+            <w:proofErr w:type="spellEnd"/>
+          </w:p>
+        </w:tc>
+        <w:tc>
+          <w:tcPr>
+            <w:tcW w:w="1285" w:type="dxa"/>
+          </w:tcPr>
+          <w:p>
+            <w:pPr>
+              <w:jc w:val="both"/>
+              <w:rPr>
+                <w:b/>
+                <w:sz w:val="18"/>
+                <w:szCs w:val="24"/>
+              </w:rPr>
+            </w:pPr>
+            <w:r>
+              <w:rPr>
+                <w:b/>
+                <w:sz w:val="18"/>
+                <w:szCs w:val="24"/>
+              </w:rPr>
+              <w:t>2 Semanas (S1-S2)</w:t>
+            </w:r>
+          </w:p>
+        </w:tc>
+        <w:tc>
+          <w:tcPr>
+            <w:tcW w:w="1284" w:type="dxa"/>
+          </w:tcPr>
+          <w:p>
+            <w:pPr>
+              <w:jc w:val="both"/>
+              <w:rPr>
+                <w:rFonts w:ascii="Calibri" w:hAnsi="Calibri" w:cs="Arial"/>
+                <w:i/>
+                <w:color w:val="548DD4"/>
+                <w:sz w:val="18"/>
+                <w:szCs w:val="20"/>
+                <w:lang w:eastAsia="es-CL"/>
+              </w:rPr>
+            </w:pPr>
+            <w:proofErr w:type="spellStart"/>
+            <w:r>
+              <w:rPr>
+                <w:rFonts w:ascii="Calibri" w:hAnsi="Calibri" w:cs="Arial"/>
+                <w:i/>
+                <w:color w:val="548DD4"/>
+                <w:sz w:val="18"/>
+                <w:szCs w:val="20"/>
+                <w:lang w:eastAsia="es-CL"/>
+              </w:rPr>
+              <w:t>Lukas</w:t>
+            </w:r>
+            <w:proofErr w:type="spellEnd"/>
+            <w:r>
+              <w:rPr>
+                <w:rFonts w:ascii="Calibri" w:hAnsi="Calibri" w:cs="Arial"/>
+                <w:i/>
+                <w:color w:val="548DD4"/>
+                <w:sz w:val="18"/>
+                <w:szCs w:val="20"/>
+                <w:lang w:eastAsia="es-CL"/>
+              </w:rPr>
+              <w:t xml:space="preserve"> Rojas / Matías Hernández</w:t>
+            </w:r>
+          </w:p>
+        </w:tc>
+        <w:tc>
+          <w:tcPr>
+            <w:tcW w:w="1285" w:type="dxa"/>
+          </w:tcPr>
+          <w:p>
+            <w:pPr>
+              <w:jc w:val="both"/>
+              <w:rPr>
+                <w:rFonts w:ascii="Calibri" w:hAnsi="Calibri" w:cs="Arial"/>
+                <w:i/>
+                <w:color w:val="548DD4"/>
+                <w:sz w:val="18"/>
+                <w:szCs w:val="20"/>
+                <w:lang w:eastAsia="es-CL"/>
+              </w:rPr>
+            </w:pPr>
+            <w:r>
+              <w:rPr>
+                <w:rFonts w:ascii="Calibri" w:hAnsi="Calibri" w:cs="Arial"/>
+                <w:i/>
+                <w:color w:val="548DD4"/>
+                <w:sz w:val="18"/>
+                <w:szCs w:val="20"/>
+                <w:lang w:eastAsia="es-CL"/>
+              </w:rPr>
+              <w:t>Facilitador: Claridad en el alcance funcional del proyecto. Dificultad: Ambigüedad en expectativas de IA</w:t>
+            </w:r>
+          </w:p>
+        </w:tc>
+        <w:tc>
+          <w:tcPr>
+            <w:tcW w:w="1428" w:type="dxa"/>
+          </w:tcPr>
+          <w:p>
+            <w:pPr>
+              <w:jc w:val="both"/>
+              <w:rPr>
+                <w:rFonts w:ascii="Calibri" w:hAnsi="Calibri" w:cs="Arial"/>
+                <w:i/>
+                <w:color w:val="548DD4"/>
+                <w:sz w:val="18"/>
+                <w:szCs w:val="20"/>
+                <w:lang w:eastAsia="es-CL"/>
+              </w:rPr>
+            </w:pPr>
+            <w:r>
+              <w:rPr>
+                <w:rFonts w:ascii="Calibri" w:hAnsi="Calibri" w:cs="Arial"/>
+                <w:i/>
+                <w:color w:val="548DD4"/>
+                <w:sz w:val="18"/>
+                <w:szCs w:val="20"/>
+                <w:lang w:eastAsia="es-CL"/>
+              </w:rPr>
+              <w:t>Completado</w:t>
+            </w:r>
+          </w:p>
+        </w:tc>
+        <w:tc>
+          <w:tcPr>
+            <w:tcW w:w="1495" w:type="dxa"/>
+          </w:tcPr>
+          <w:p>
+            <w:pPr>
+              <w:jc w:val="both"/>
+              <w:rPr>
+                <w:rFonts w:ascii="Calibri" w:hAnsi="Calibri" w:cs="Arial"/>
+                <w:i/>
+                <w:color w:val="548DD4"/>
+                <w:sz w:val="18"/>
+                <w:szCs w:val="20"/>
+                <w:lang w:eastAsia="es-CL"/>
+              </w:rPr>
+            </w:pPr>
+            <w:r>
+              <w:rPr>
+                <w:rFonts w:ascii="Calibri" w:hAnsi="Calibri" w:cs="Arial"/>
+                <w:i/>
+                <w:color w:val="548DD4"/>
+                <w:sz w:val="18"/>
+                <w:szCs w:val="20"/>
+                <w:lang w:eastAsia="es-CL"/>
+              </w:rPr>
+              <w:t>Ninguno</w:t>
+            </w:r>
+          </w:p>
+        </w:tc>
+      </w:tr>
+      <w:tr>
+        <w:trPr>
+          <w:trHeight w:val="1241"/>
+        </w:trPr>
+        <w:tc>
+          <w:tcPr>
+            <w:tcW w:w="1338" w:type="dxa"/>
+          </w:tcPr>
+          <w:p>
+            <w:pPr>
+              <w:jc w:val="both"/>
+            </w:pPr>
+            <w:r>
+              <w:t>Diseño de software y  BD</w:t>
+            </w:r>
+          </w:p>
+        </w:tc>
+        <w:tc>
+          <w:tcPr>
+            <w:tcW w:w="1085" w:type="dxa"/>
+          </w:tcPr>
+          <w:p>
+            <w:pPr>
+              <w:jc w:val="both"/>
+              <w:rPr>
+                <w:rFonts w:ascii="Calibri" w:hAnsi="Calibri" w:cs="Arial"/>
+                <w:i/>
+                <w:color w:val="548DD4"/>
+                <w:sz w:val="18"/>
+                <w:szCs w:val="20"/>
+                <w:lang w:eastAsia="es-CL"/>
+              </w:rPr>
+            </w:pPr>
+            <w:r>
+              <w:rPr>
+                <w:rFonts w:ascii="Calibri" w:hAnsi="Calibri" w:cs="Arial"/>
+                <w:i/>
+                <w:color w:val="548DD4"/>
+                <w:sz w:val="18"/>
+                <w:szCs w:val="20"/>
+                <w:lang w:eastAsia="es-CL"/>
+              </w:rPr>
+              <w:t>2.Diseño de arquitectura y modelo de datos</w:t>
+            </w:r>
+          </w:p>
+        </w:tc>
+        <w:tc>
+          <w:tcPr>
+            <w:tcW w:w="1285" w:type="dxa"/>
+          </w:tcPr>
+          <w:p>
+            <w:pPr>
+              <w:jc w:val="both"/>
+              <w:rPr>
+                <w:b/>
+                <w:sz w:val="18"/>
+                <w:szCs w:val="24"/>
+              </w:rPr>
+            </w:pPr>
+            <w:proofErr w:type="spellStart"/>
+            <w:r>
+              <w:rPr>
+                <w:b/>
+                <w:sz w:val="18"/>
+                <w:szCs w:val="24"/>
+              </w:rPr>
+              <w:t>Figma</w:t>
+            </w:r>
+            <w:proofErr w:type="spellEnd"/>
+            <w:r>
+              <w:rPr>
+                <w:b/>
+                <w:sz w:val="18"/>
+                <w:szCs w:val="24"/>
+              </w:rPr>
+              <w:t xml:space="preserve">, </w:t>
+            </w:r>
+            <w:proofErr w:type="spellStart"/>
+            <w:r>
+              <w:rPr>
+                <w:b/>
+                <w:sz w:val="18"/>
+                <w:szCs w:val="24"/>
+              </w:rPr>
+              <w:t>dbdiagram.io,Enterprise</w:t>
+            </w:r>
+            <w:proofErr w:type="spellEnd"/>
+            <w:r>
+              <w:rPr>
+                <w:b/>
+                <w:sz w:val="18"/>
+                <w:szCs w:val="24"/>
+              </w:rPr>
+              <w:t xml:space="preserve"> </w:t>
+            </w:r>
+            <w:proofErr w:type="spellStart"/>
+            <w:r>
+              <w:rPr>
+                <w:b/>
+                <w:sz w:val="18"/>
+                <w:szCs w:val="24"/>
+              </w:rPr>
+              <w:t>architect</w:t>
+            </w:r>
+            <w:proofErr w:type="spellEnd"/>
+          </w:p>
+        </w:tc>
+        <w:tc>
+          <w:tcPr>
+            <w:tcW w:w="1285" w:type="dxa"/>
+          </w:tcPr>
+          <w:p>
+            <w:pPr>
+              <w:jc w:val="both"/>
+              <w:rPr>
+                <w:b/>
+                <w:sz w:val="18"/>
+                <w:szCs w:val="24"/>
+              </w:rPr>
+            </w:pPr>
+            <w:r>
+              <w:rPr>
+                <w:b/>
+                <w:sz w:val="18"/>
+                <w:szCs w:val="24"/>
+              </w:rPr>
+              <w:t>2 semanas (S3-S4)</w:t>
+            </w:r>
+          </w:p>
+        </w:tc>
+        <w:tc>
+          <w:tcPr>
+            <w:tcW w:w="1284" w:type="dxa"/>
+          </w:tcPr>
+          <w:p>
+            <w:pPr>
+              <w:jc w:val="both"/>
+              <w:rPr>
+                <w:rFonts w:ascii="Calibri" w:hAnsi="Calibri" w:cs="Arial"/>
+                <w:i/>
+                <w:color w:val="548DD4"/>
+                <w:sz w:val="18"/>
+                <w:szCs w:val="20"/>
+                <w:lang w:eastAsia="es-CL"/>
+              </w:rPr>
+            </w:pPr>
+            <w:r>
+              <w:rPr>
+                <w:rFonts w:ascii="Calibri" w:hAnsi="Calibri" w:cs="Arial"/>
+                <w:i/>
+                <w:color w:val="548DD4"/>
+                <w:sz w:val="18"/>
+                <w:szCs w:val="20"/>
+                <w:lang w:eastAsia="es-CL"/>
+              </w:rPr>
+              <w:t>Tomas Vallejos/</w:t>
+            </w:r>
+            <w:proofErr w:type="spellStart"/>
+            <w:r>
+              <w:rPr>
+                <w:rFonts w:ascii="Calibri" w:hAnsi="Calibri" w:cs="Arial"/>
+                <w:i/>
+                <w:color w:val="548DD4"/>
+                <w:sz w:val="18"/>
+                <w:szCs w:val="20"/>
+                <w:lang w:eastAsia="es-CL"/>
+              </w:rPr>
+              <w:t>Lukas</w:t>
+            </w:r>
+            <w:proofErr w:type="spellEnd"/>
+            <w:r>
+              <w:rPr>
+                <w:rFonts w:ascii="Calibri" w:hAnsi="Calibri" w:cs="Arial"/>
+                <w:i/>
+                <w:color w:val="548DD4"/>
+                <w:sz w:val="18"/>
+                <w:szCs w:val="20"/>
+                <w:lang w:eastAsia="es-CL"/>
+              </w:rPr>
+              <w:t xml:space="preserve"> Rojas</w:t>
+            </w:r>
+          </w:p>
+        </w:tc>
+        <w:tc>
+          <w:tcPr>
+            <w:tcW w:w="1285" w:type="dxa"/>
+          </w:tcPr>
+          <w:p>
+            <w:pPr>
+              <w:jc w:val="both"/>
+              <w:rPr>
+                <w:rFonts w:ascii="Calibri" w:hAnsi="Calibri" w:cs="Arial"/>
+                <w:i/>
+                <w:color w:val="548DD4"/>
+                <w:sz w:val="18"/>
+                <w:szCs w:val="20"/>
+                <w:lang w:eastAsia="es-CL"/>
+              </w:rPr>
+            </w:pPr>
+            <w:r>
+              <w:rPr>
+                <w:rFonts w:ascii="Calibri" w:hAnsi="Calibri" w:cs="Arial"/>
+                <w:i/>
+                <w:color w:val="548DD4"/>
+                <w:sz w:val="18"/>
+                <w:szCs w:val="20"/>
+                <w:lang w:eastAsia="es-CL"/>
+              </w:rPr>
+              <w:t xml:space="preserve">Facilitador: uso estándares UML/C4. Dificultad: complejidad en la estructura de productos </w:t>
+            </w:r>
+          </w:p>
+        </w:tc>
+        <w:tc>
+          <w:tcPr>
+            <w:tcW w:w="1428" w:type="dxa"/>
+          </w:tcPr>
+          <w:p>
+            <w:pPr>
+              <w:jc w:val="both"/>
+              <w:rPr>
+                <w:rFonts w:ascii="Calibri" w:hAnsi="Calibri" w:cs="Arial"/>
+                <w:i/>
+                <w:color w:val="548DD4"/>
+                <w:sz w:val="18"/>
+                <w:szCs w:val="20"/>
+                <w:lang w:eastAsia="es-CL"/>
+              </w:rPr>
+            </w:pPr>
+            <w:r>
+              <w:rPr>
+                <w:rFonts w:ascii="Calibri" w:hAnsi="Calibri" w:cs="Arial"/>
+                <w:i/>
+                <w:color w:val="548DD4"/>
+                <w:sz w:val="18"/>
+                <w:szCs w:val="20"/>
+                <w:lang w:eastAsia="es-CL"/>
+              </w:rPr>
+              <w:t>Completado</w:t>
+            </w:r>
+          </w:p>
+        </w:tc>
+        <w:tc>
+          <w:tcPr>
+            <w:tcW w:w="1495" w:type="dxa"/>
+          </w:tcPr>
+          <w:p>
+            <w:pPr>
+              <w:jc w:val="both"/>
+              <w:rPr>
+                <w:rFonts w:ascii="Calibri" w:hAnsi="Calibri" w:cs="Arial"/>
+                <w:i/>
+                <w:color w:val="548DD4"/>
+                <w:sz w:val="18"/>
+                <w:szCs w:val="20"/>
+                <w:lang w:eastAsia="es-CL"/>
+              </w:rPr>
+            </w:pPr>
+            <w:r>
+              <w:rPr>
+                <w:rFonts w:ascii="Calibri" w:hAnsi="Calibri" w:cs="Arial"/>
+                <w:i/>
+                <w:color w:val="548DD4"/>
+                <w:sz w:val="18"/>
+                <w:szCs w:val="20"/>
+                <w:lang w:eastAsia="es-CL"/>
+              </w:rPr>
+              <w:t>Creación e implementación de scripts de migración SQL del 001 al 004</w:t>
+            </w:r>
+          </w:p>
+        </w:tc>
+      </w:tr>
+      <w:tr>
+        <w:trPr>
+          <w:trHeight w:val="1885"/>
+        </w:trPr>
+        <w:tc>
+          <w:tcPr>
+            <w:tcW w:w="1338" w:type="dxa"/>
+          </w:tcPr>
+          <w:p>
+            <w:pPr>
+              <w:jc w:val="both"/>
+            </w:pPr>
+            <w:r>
+              <w:t>Desarrollo /BDD</w:t>
+            </w:r>
+          </w:p>
+        </w:tc>
+        <w:tc>
+          <w:tcPr>
+            <w:tcW w:w="1085" w:type="dxa"/>
+          </w:tcPr>
+          <w:p>
+            <w:pPr>
+              <w:jc w:val="both"/>
+              <w:rPr>
+                <w:rFonts w:ascii="Calibri" w:hAnsi="Calibri" w:cs="Arial"/>
+                <w:i/>
+                <w:color w:val="548DD4"/>
+                <w:sz w:val="18"/>
+                <w:szCs w:val="20"/>
+                <w:lang w:eastAsia="es-CL"/>
+              </w:rPr>
+            </w:pPr>
+            <w:r>
+              <w:rPr>
+                <w:rFonts w:ascii="Calibri" w:hAnsi="Calibri" w:cs="Arial"/>
+                <w:i/>
+                <w:color w:val="548DD4"/>
+                <w:sz w:val="18"/>
+                <w:szCs w:val="20"/>
+                <w:lang w:eastAsia="es-CL"/>
+              </w:rPr>
+              <w:t>3.Desarrollo del motor de extracción (</w:t>
+            </w:r>
+            <w:proofErr w:type="spellStart"/>
+            <w:r>
+              <w:rPr>
+                <w:rFonts w:ascii="Calibri" w:hAnsi="Calibri" w:cs="Arial"/>
+                <w:i/>
+                <w:color w:val="548DD4"/>
+                <w:sz w:val="18"/>
+                <w:szCs w:val="20"/>
+                <w:lang w:eastAsia="es-CL"/>
+              </w:rPr>
+              <w:t>scraping</w:t>
+            </w:r>
+            <w:proofErr w:type="spellEnd"/>
+            <w:r>
+              <w:rPr>
+                <w:rFonts w:ascii="Calibri" w:hAnsi="Calibri" w:cs="Arial"/>
+                <w:i/>
+                <w:color w:val="548DD4"/>
+                <w:sz w:val="18"/>
+                <w:szCs w:val="20"/>
+                <w:lang w:eastAsia="es-CL"/>
+              </w:rPr>
+              <w:t xml:space="preserve">) y </w:t>
+            </w:r>
+            <w:proofErr w:type="spellStart"/>
+            <w:r>
+              <w:rPr>
+                <w:rFonts w:ascii="Calibri" w:hAnsi="Calibri" w:cs="Arial"/>
+                <w:i/>
+                <w:color w:val="548DD4"/>
+                <w:sz w:val="18"/>
+                <w:szCs w:val="20"/>
+                <w:lang w:eastAsia="es-CL"/>
+              </w:rPr>
+              <w:t>backend</w:t>
+            </w:r>
+            <w:proofErr w:type="spellEnd"/>
+          </w:p>
+        </w:tc>
+        <w:tc>
+          <w:tcPr>
+            <w:tcW w:w="1285" w:type="dxa"/>
+          </w:tcPr>
+          <w:p>
+            <w:pPr>
+              <w:jc w:val="both"/>
+              <w:rPr>
+                <w:b/>
+                <w:sz w:val="18"/>
+                <w:szCs w:val="24"/>
+              </w:rPr>
+            </w:pPr>
+            <w:proofErr w:type="spellStart"/>
+            <w:r>
+              <w:rPr>
+                <w:b/>
+                <w:sz w:val="18"/>
+                <w:szCs w:val="24"/>
+              </w:rPr>
+              <w:t>Python</w:t>
+            </w:r>
+            <w:proofErr w:type="spellEnd"/>
+            <w:r>
+              <w:rPr>
+                <w:b/>
+                <w:sz w:val="18"/>
+                <w:szCs w:val="24"/>
+              </w:rPr>
+              <w:t>(</w:t>
+            </w:r>
+            <w:proofErr w:type="spellStart"/>
+            <w:r>
+              <w:rPr>
+                <w:b/>
+                <w:sz w:val="18"/>
+                <w:szCs w:val="24"/>
+              </w:rPr>
+              <w:t>Playwright,Scrapy</w:t>
+            </w:r>
+            <w:proofErr w:type="spellEnd"/>
+            <w:r>
+              <w:rPr>
+                <w:b/>
+                <w:sz w:val="18"/>
+                <w:szCs w:val="24"/>
+              </w:rPr>
+              <w:t xml:space="preserve">), Node.js, </w:t>
+            </w:r>
+            <w:proofErr w:type="spellStart"/>
+            <w:r>
+              <w:rPr>
+                <w:b/>
+                <w:sz w:val="18"/>
+                <w:szCs w:val="24"/>
+              </w:rPr>
+              <w:t>PostgreSQL</w:t>
+            </w:r>
+            <w:proofErr w:type="spellEnd"/>
+          </w:p>
+        </w:tc>
+        <w:tc>
+          <w:tcPr>
+            <w:tcW w:w="1285" w:type="dxa"/>
+          </w:tcPr>
+          <w:p>
+            <w:pPr>
+              <w:jc w:val="both"/>
+              <w:rPr>
+                <w:b/>
+                <w:sz w:val="18"/>
+                <w:szCs w:val="24"/>
+              </w:rPr>
+            </w:pPr>
+            <w:r>
+              <w:rPr>
+                <w:b/>
+                <w:sz w:val="18"/>
+                <w:szCs w:val="24"/>
+              </w:rPr>
+              <w:t>4 semanas (S5-S8)</w:t>
+            </w:r>
+          </w:p>
+        </w:tc>
+        <w:tc>
+          <w:tcPr>
+            <w:tcW w:w="1284" w:type="dxa"/>
+          </w:tcPr>
+          <w:p>
+            <w:pPr>
+              <w:jc w:val="both"/>
+              <w:rPr>
+                <w:rFonts w:ascii="Calibri" w:hAnsi="Calibri" w:cs="Arial"/>
+                <w:i/>
+                <w:color w:val="548DD4"/>
+                <w:sz w:val="18"/>
+                <w:szCs w:val="20"/>
+                <w:lang w:eastAsia="es-CL"/>
+              </w:rPr>
+            </w:pPr>
+            <w:proofErr w:type="spellStart"/>
+            <w:r>
+              <w:rPr>
+                <w:rFonts w:ascii="Calibri" w:hAnsi="Calibri" w:cs="Arial"/>
+                <w:i/>
+                <w:color w:val="548DD4"/>
+                <w:sz w:val="18"/>
+                <w:szCs w:val="20"/>
+                <w:lang w:eastAsia="es-CL"/>
+              </w:rPr>
+              <w:t>Luksa</w:t>
+            </w:r>
+            <w:proofErr w:type="spellEnd"/>
+            <w:r>
+              <w:rPr>
+                <w:rFonts w:ascii="Calibri" w:hAnsi="Calibri" w:cs="Arial"/>
+                <w:i/>
+                <w:color w:val="548DD4"/>
+                <w:sz w:val="18"/>
+                <w:szCs w:val="20"/>
+                <w:lang w:eastAsia="es-CL"/>
+              </w:rPr>
+              <w:t xml:space="preserve"> Rojas/Matías Hernán  </w:t>
+            </w:r>
+            <w:proofErr w:type="spellStart"/>
+            <w:r>
+              <w:rPr>
+                <w:rFonts w:ascii="Calibri" w:hAnsi="Calibri" w:cs="Arial"/>
+                <w:i/>
+                <w:color w:val="548DD4"/>
+                <w:sz w:val="18"/>
+                <w:szCs w:val="20"/>
+                <w:lang w:eastAsia="es-CL"/>
+              </w:rPr>
+              <w:t>cdez</w:t>
+            </w:r>
+            <w:proofErr w:type="spellEnd"/>
+          </w:p>
+        </w:tc>
+        <w:tc>
+          <w:tcPr>
+            <w:tcW w:w="1285" w:type="dxa"/>
+          </w:tcPr>
+          <w:p>
+            <w:pPr>
+              <w:jc w:val="both"/>
+              <w:rPr>
+                <w:rFonts w:ascii="Calibri" w:hAnsi="Calibri" w:cs="Arial"/>
+                <w:i/>
+                <w:color w:val="548DD4"/>
+                <w:sz w:val="18"/>
+                <w:szCs w:val="20"/>
+                <w:lang w:eastAsia="es-CL"/>
+              </w:rPr>
+            </w:pPr>
+            <w:r>
+              <w:rPr>
+                <w:rFonts w:ascii="Calibri" w:hAnsi="Calibri" w:cs="Arial"/>
+                <w:i/>
+                <w:color w:val="548DD4"/>
+                <w:sz w:val="18"/>
+                <w:szCs w:val="20"/>
+                <w:lang w:eastAsia="es-CL"/>
+              </w:rPr>
+              <w:t>Dificultad: bloqueos y datos no estructurados en e-</w:t>
+            </w:r>
+            <w:proofErr w:type="spellStart"/>
+            <w:r>
+              <w:rPr>
+                <w:rFonts w:ascii="Calibri" w:hAnsi="Calibri" w:cs="Arial"/>
+                <w:i/>
+                <w:color w:val="548DD4"/>
+                <w:sz w:val="18"/>
+                <w:szCs w:val="20"/>
+                <w:lang w:eastAsia="es-CL"/>
+              </w:rPr>
+              <w:t>commerce</w:t>
+            </w:r>
+            <w:proofErr w:type="spellEnd"/>
+          </w:p>
+        </w:tc>
+        <w:tc>
+          <w:tcPr>
+            <w:tcW w:w="1428" w:type="dxa"/>
+          </w:tcPr>
+          <w:p>
+            <w:pPr>
+              <w:jc w:val="both"/>
+              <w:rPr>
+                <w:rFonts w:ascii="Calibri" w:hAnsi="Calibri" w:cs="Arial"/>
+                <w:i/>
+                <w:color w:val="548DD4"/>
+                <w:sz w:val="18"/>
+                <w:szCs w:val="20"/>
+                <w:lang w:eastAsia="es-CL"/>
+              </w:rPr>
+            </w:pPr>
+            <w:r>
+              <w:rPr>
+                <w:rFonts w:ascii="Calibri" w:hAnsi="Calibri" w:cs="Arial"/>
+                <w:i/>
+                <w:color w:val="548DD4"/>
+                <w:sz w:val="18"/>
+                <w:szCs w:val="20"/>
+                <w:lang w:eastAsia="es-CL"/>
+              </w:rPr>
+              <w:t>En Curso</w:t>
+            </w:r>
+          </w:p>
+        </w:tc>
+        <w:tc>
+          <w:tcPr>
+            <w:tcW w:w="1495" w:type="dxa"/>
+          </w:tcPr>
+          <w:p>
+            <w:pPr>
+              <w:jc w:val="both"/>
+              <w:rPr>
+                <w:rFonts w:ascii="Calibri" w:hAnsi="Calibri" w:cs="Arial"/>
+                <w:i/>
+                <w:color w:val="548DD4"/>
+                <w:sz w:val="18"/>
+                <w:szCs w:val="20"/>
+                <w:lang w:eastAsia="es-CL"/>
+              </w:rPr>
+            </w:pPr>
+            <w:r>
+              <w:rPr>
+                <w:rFonts w:ascii="Calibri" w:hAnsi="Calibri" w:cs="Arial"/>
+                <w:i/>
+                <w:color w:val="548DD4"/>
+                <w:sz w:val="18"/>
+                <w:szCs w:val="20"/>
+                <w:lang w:eastAsia="es-CL"/>
+              </w:rPr>
+              <w:t>Implementación de cola de revisión manual (</w:t>
+            </w:r>
+            <w:proofErr w:type="spellStart"/>
+            <w:r>
+              <w:rPr>
+                <w:rFonts w:ascii="Calibri" w:hAnsi="Calibri" w:cs="Arial"/>
+                <w:i/>
+                <w:color w:val="548DD4"/>
+                <w:sz w:val="18"/>
+                <w:szCs w:val="20"/>
+                <w:lang w:eastAsia="es-CL"/>
+              </w:rPr>
+              <w:t>review_queue</w:t>
+            </w:r>
+            <w:proofErr w:type="spellEnd"/>
+            <w:r>
+              <w:rPr>
+                <w:rFonts w:ascii="Calibri" w:hAnsi="Calibri" w:cs="Arial"/>
+                <w:i/>
+                <w:color w:val="548DD4"/>
+                <w:sz w:val="18"/>
+                <w:szCs w:val="20"/>
+                <w:lang w:eastAsia="es-CL"/>
+              </w:rPr>
+              <w:t>) para validación de datos</w:t>
+            </w:r>
+          </w:p>
+        </w:tc>
+      </w:tr>
+      <w:tr>
+        <w:trPr>
+          <w:trHeight w:val="1241"/>
+        </w:trPr>
+        <w:tc>
+          <w:tcPr>
+            <w:tcW w:w="1338" w:type="dxa"/>
+          </w:tcPr>
+          <w:p>
+            <w:pPr>
+              <w:jc w:val="both"/>
+              <w:rPr>
+                <w:b/>
+                <w:sz w:val="18"/>
+                <w:szCs w:val="24"/>
+              </w:rPr>
+            </w:pPr>
+            <w:r>
+              <w:t>Desarrollo/Innovación de IA</w:t>
+            </w:r>
+          </w:p>
+        </w:tc>
+        <w:tc>
+          <w:tcPr>
+            <w:tcW w:w="1085" w:type="dxa"/>
+          </w:tcPr>
+          <w:p>
+            <w:pPr>
+              <w:jc w:val="both"/>
+              <w:rPr>
+                <w:rFonts w:ascii="Calibri" w:hAnsi="Calibri" w:cs="Arial"/>
+                <w:i/>
+                <w:color w:val="548DD4"/>
+                <w:sz w:val="18"/>
+                <w:szCs w:val="20"/>
+                <w:lang w:eastAsia="es-CL"/>
+              </w:rPr>
+            </w:pPr>
+            <w:r>
+              <w:rPr>
+                <w:rFonts w:ascii="Calibri" w:hAnsi="Calibri" w:cs="Arial"/>
+                <w:i/>
+                <w:color w:val="548DD4"/>
+                <w:sz w:val="18"/>
+                <w:szCs w:val="20"/>
+                <w:lang w:eastAsia="es-CL"/>
+              </w:rPr>
+              <w:t>4.Modulo IA y modelo de coincidencia (</w:t>
+            </w:r>
+            <w:proofErr w:type="spellStart"/>
+            <w:r>
+              <w:rPr>
+                <w:rFonts w:ascii="Calibri" w:hAnsi="Calibri" w:cs="Arial"/>
+                <w:i/>
+                <w:color w:val="548DD4"/>
+                <w:sz w:val="18"/>
+                <w:szCs w:val="20"/>
+                <w:lang w:eastAsia="es-CL"/>
+              </w:rPr>
+              <w:t>matchmaking</w:t>
+            </w:r>
+            <w:proofErr w:type="spellEnd"/>
+            <w:r>
+              <w:rPr>
+                <w:rFonts w:ascii="Calibri" w:hAnsi="Calibri" w:cs="Arial"/>
+                <w:i/>
+                <w:color w:val="548DD4"/>
+                <w:sz w:val="18"/>
+                <w:szCs w:val="20"/>
+                <w:lang w:eastAsia="es-CL"/>
+              </w:rPr>
+              <w:t>)</w:t>
+            </w:r>
+          </w:p>
+        </w:tc>
+        <w:tc>
+          <w:tcPr>
+            <w:tcW w:w="1285" w:type="dxa"/>
+          </w:tcPr>
+          <w:p>
+            <w:pPr>
+              <w:jc w:val="both"/>
+              <w:rPr>
+                <w:b/>
+                <w:sz w:val="18"/>
+                <w:szCs w:val="24"/>
+              </w:rPr>
+            </w:pPr>
+            <w:proofErr w:type="spellStart"/>
+            <w:r>
+              <w:rPr>
+                <w:b/>
+                <w:sz w:val="18"/>
+                <w:szCs w:val="24"/>
+              </w:rPr>
+              <w:t>OpenAI</w:t>
+            </w:r>
+            <w:proofErr w:type="spellEnd"/>
+            <w:r>
+              <w:rPr>
+                <w:b/>
+                <w:sz w:val="18"/>
+                <w:szCs w:val="24"/>
+              </w:rPr>
+              <w:t>/</w:t>
+            </w:r>
+            <w:proofErr w:type="spellStart"/>
+            <w:r>
+              <w:rPr>
+                <w:b/>
+                <w:sz w:val="18"/>
+                <w:szCs w:val="24"/>
+              </w:rPr>
+              <w:t>Gemini</w:t>
+            </w:r>
+            <w:proofErr w:type="spellEnd"/>
+            <w:r>
+              <w:rPr>
+                <w:b/>
+                <w:sz w:val="18"/>
+                <w:szCs w:val="24"/>
+              </w:rPr>
+              <w:t xml:space="preserve"> API, </w:t>
+            </w:r>
+            <w:proofErr w:type="spellStart"/>
+            <w:r>
+              <w:rPr>
+                <w:b/>
+                <w:sz w:val="18"/>
+                <w:szCs w:val="24"/>
+              </w:rPr>
+              <w:t>Python</w:t>
+            </w:r>
+            <w:proofErr w:type="spellEnd"/>
+            <w:r>
+              <w:rPr>
+                <w:b/>
+                <w:sz w:val="18"/>
+                <w:szCs w:val="24"/>
+              </w:rPr>
+              <w:t xml:space="preserve">, </w:t>
+            </w:r>
+            <w:proofErr w:type="spellStart"/>
+            <w:r>
+              <w:rPr>
+                <w:b/>
+                <w:sz w:val="18"/>
+                <w:szCs w:val="24"/>
+              </w:rPr>
+              <w:t>LangChain</w:t>
+            </w:r>
+            <w:proofErr w:type="spellEnd"/>
+          </w:p>
+        </w:tc>
+        <w:tc>
+          <w:tcPr>
+            <w:tcW w:w="1285" w:type="dxa"/>
+          </w:tcPr>
+          <w:p>
+            <w:pPr>
+              <w:jc w:val="both"/>
+              <w:rPr>
+                <w:b/>
+                <w:sz w:val="18"/>
+                <w:szCs w:val="24"/>
+              </w:rPr>
+            </w:pPr>
+            <w:r>
+              <w:rPr>
+                <w:b/>
+                <w:sz w:val="18"/>
+                <w:szCs w:val="24"/>
+              </w:rPr>
+              <w:t>4 semanas (S9-S12)</w:t>
+            </w:r>
+          </w:p>
+        </w:tc>
+        <w:tc>
+          <w:tcPr>
+            <w:tcW w:w="1284" w:type="dxa"/>
+          </w:tcPr>
+          <w:p>
+            <w:pPr>
+              <w:jc w:val="both"/>
+              <w:rPr>
+                <w:rFonts w:ascii="Calibri" w:hAnsi="Calibri" w:cs="Arial"/>
+                <w:i/>
+                <w:color w:val="548DD4"/>
+                <w:sz w:val="18"/>
+                <w:szCs w:val="20"/>
+                <w:lang w:eastAsia="es-CL"/>
+              </w:rPr>
+            </w:pPr>
+            <w:r>
+              <w:rPr>
+                <w:rFonts w:ascii="Calibri" w:hAnsi="Calibri" w:cs="Arial"/>
+                <w:i/>
+                <w:color w:val="548DD4"/>
+                <w:sz w:val="18"/>
+                <w:szCs w:val="20"/>
+                <w:lang w:eastAsia="es-CL"/>
+              </w:rPr>
+              <w:t>Matías Hernández</w:t>
+            </w:r>
+          </w:p>
+        </w:tc>
+        <w:tc>
+          <w:tcPr>
+            <w:tcW w:w="1285" w:type="dxa"/>
+          </w:tcPr>
+          <w:p>
+            <w:pPr>
+              <w:jc w:val="both"/>
+              <w:rPr>
+                <w:rFonts w:ascii="Calibri" w:hAnsi="Calibri" w:cs="Arial"/>
+                <w:i/>
+                <w:color w:val="548DD4"/>
+                <w:sz w:val="18"/>
+                <w:szCs w:val="20"/>
+                <w:lang w:eastAsia="es-CL"/>
+              </w:rPr>
+            </w:pPr>
+            <w:r>
+              <w:rPr>
+                <w:rFonts w:ascii="Calibri" w:hAnsi="Calibri" w:cs="Arial"/>
+                <w:i/>
+                <w:color w:val="548DD4"/>
+                <w:sz w:val="18"/>
+                <w:szCs w:val="20"/>
+                <w:lang w:eastAsia="es-CL"/>
+              </w:rPr>
+              <w:t>Dificultad: precisión de coincidencias de productos entre tiendas</w:t>
+            </w:r>
+          </w:p>
+        </w:tc>
+        <w:tc>
+          <w:tcPr>
+            <w:tcW w:w="1428" w:type="dxa"/>
+          </w:tcPr>
+          <w:p>
+            <w:pPr>
+              <w:jc w:val="both"/>
+              <w:rPr>
+                <w:rFonts w:ascii="Calibri" w:hAnsi="Calibri" w:cs="Arial"/>
+                <w:i/>
+                <w:color w:val="C00000"/>
+                <w:sz w:val="16"/>
+                <w:szCs w:val="20"/>
+                <w:lang w:eastAsia="es-CL"/>
+              </w:rPr>
+            </w:pPr>
+            <w:r>
+              <w:rPr>
+                <w:rFonts w:ascii="Calibri" w:hAnsi="Calibri" w:cs="Arial"/>
+                <w:i/>
+                <w:color w:val="548DD4"/>
+                <w:sz w:val="18"/>
+                <w:szCs w:val="20"/>
+                <w:lang w:eastAsia="es-CL"/>
+              </w:rPr>
+              <w:t>En Curso</w:t>
+            </w:r>
+          </w:p>
+        </w:tc>
+        <w:tc>
+          <w:tcPr>
+            <w:tcW w:w="1495" w:type="dxa"/>
+          </w:tcPr>
+          <w:p>
+            <w:pPr>
+              <w:jc w:val="both"/>
+              <w:rPr>
+                <w:rFonts w:ascii="Calibri" w:hAnsi="Calibri" w:cs="Arial"/>
+                <w:i/>
+                <w:color w:val="548DD4"/>
+                <w:sz w:val="18"/>
+                <w:szCs w:val="20"/>
+                <w:lang w:eastAsia="es-CL"/>
+              </w:rPr>
+            </w:pPr>
+            <w:r>
+              <w:rPr>
+                <w:rFonts w:ascii="Calibri" w:hAnsi="Calibri" w:cs="Arial"/>
+                <w:i/>
+                <w:color w:val="548DD4"/>
+                <w:sz w:val="18"/>
+                <w:szCs w:val="20"/>
+                <w:lang w:eastAsia="es-CL"/>
+              </w:rPr>
+              <w:t xml:space="preserve">Creación e integración previa de </w:t>
+            </w:r>
+            <w:proofErr w:type="spellStart"/>
+            <w:r>
+              <w:rPr>
+                <w:rFonts w:ascii="Calibri" w:hAnsi="Calibri" w:cs="Arial"/>
+                <w:i/>
+                <w:color w:val="548DD4"/>
+                <w:sz w:val="18"/>
+                <w:szCs w:val="20"/>
+                <w:lang w:eastAsia="es-CL"/>
+              </w:rPr>
+              <w:t>datasets</w:t>
+            </w:r>
+            <w:proofErr w:type="spellEnd"/>
+            <w:r>
+              <w:rPr>
+                <w:rFonts w:ascii="Calibri" w:hAnsi="Calibri" w:cs="Arial"/>
+                <w:i/>
+                <w:color w:val="548DD4"/>
+                <w:sz w:val="18"/>
+                <w:szCs w:val="20"/>
+                <w:lang w:eastAsia="es-CL"/>
+              </w:rPr>
+              <w:t xml:space="preserve"> etiquetados</w:t>
+            </w:r>
+          </w:p>
+          <w:p>
+            <w:pPr>
+              <w:jc w:val="both"/>
+              <w:rPr>
+                <w:rFonts w:ascii="Calibri" w:hAnsi="Calibri" w:cs="Arial"/>
+                <w:i/>
+                <w:color w:val="548DD4"/>
+                <w:sz w:val="18"/>
+                <w:szCs w:val="20"/>
+                <w:lang w:eastAsia="es-CL"/>
+              </w:rPr>
+            </w:pPr>
           </w:p>
         </w:tc>
       </w:tr>
@@ -2217,7 +3334,33 @@
                 <w:szCs w:val="20"/>
                 <w:lang w:eastAsia="es-CL"/>
               </w:rPr>
-              <w:t>Un factor facilitador importante ha sido la definición temprana de los esquemas de base de datos relacional y el uso de documentación estructurada, lo que permitió tener listos los scripts de migración (del 001 al 004) y la estructura de la API. Como principal dificultad se presentó la variabilidad, formato no estructurado y bloqueos de las páginas objetivo del e-</w:t>
+              <w:t>Facilitadores: Un factor clave ha sido la definición temprana de los esquemas de base de datos relacionales y la documentación técnica estructurada. Esto permitió avanzar sin contratiempos en los scripts de migración (001 al 004) y en la arquitectura inicial de la API.</w:t>
+            </w:r>
+          </w:p>
+          <w:p>
+            <w:pPr>
+              <w:jc w:val="both"/>
+              <w:rPr>
+                <w:rFonts w:ascii="Calibri" w:hAnsi="Calibri" w:cs="Arial"/>
+                <w:i/>
+                <w:iCs/>
+                <w:color w:val="548DD4"/>
+                <w:sz w:val="20"/>
+                <w:szCs w:val="20"/>
+                <w:lang w:eastAsia="es-CL"/>
+              </w:rPr>
+            </w:pPr>
+            <w:r>
+              <w:rPr>
+                <w:rFonts w:ascii="Calibri" w:hAnsi="Calibri" w:cs="Arial"/>
+                <w:i/>
+                <w:iCs/>
+                <w:color w:val="548DD4"/>
+                <w:sz w:val="20"/>
+                <w:szCs w:val="20"/>
+                <w:lang w:eastAsia="es-CL"/>
+              </w:rPr>
+              <w:t>Dificultades: La principal dificultad radicó en la alta variabilidad y los bloqueos eventuales en los e-</w:t>
             </w:r>
             <w:proofErr w:type="spellStart"/>
             <w:r>
@@ -2243,7 +3386,7 @@
                 <w:szCs w:val="20"/>
                 <w:lang w:eastAsia="es-CL"/>
               </w:rPr>
-              <w:t xml:space="preserve"> al realizar web </w:t>
+              <w:t xml:space="preserve"> al momento de ejecutar el web </w:t>
             </w:r>
             <w:proofErr w:type="spellStart"/>
             <w:r>
@@ -2269,7 +3412,33 @@
                 <w:szCs w:val="20"/>
                 <w:lang w:eastAsia="es-CL"/>
               </w:rPr>
-              <w:t>. Para solucionar esto, abordamos el obstáculo creando Pruebas de Concepto (</w:t>
+              <w:t>, así como la discrepancia de nombres de productos entre tiendas.</w:t>
+            </w:r>
+          </w:p>
+          <w:p>
+            <w:pPr>
+              <w:jc w:val="both"/>
+              <w:rPr>
+                <w:rFonts w:ascii="Calibri" w:hAnsi="Calibri" w:cs="Arial"/>
+                <w:i/>
+                <w:iCs/>
+                <w:color w:val="548DD4"/>
+                <w:sz w:val="20"/>
+                <w:szCs w:val="20"/>
+                <w:lang w:eastAsia="es-CL"/>
+              </w:rPr>
+            </w:pPr>
+            <w:r>
+              <w:rPr>
+                <w:rFonts w:ascii="Calibri" w:hAnsi="Calibri" w:cs="Arial"/>
+                <w:i/>
+                <w:iCs/>
+                <w:color w:val="548DD4"/>
+                <w:sz w:val="20"/>
+                <w:szCs w:val="20"/>
+                <w:lang w:eastAsia="es-CL"/>
+              </w:rPr>
+              <w:t>Abordaje: Para superar este obstáculo, creamos Pruebas de Concepto (</w:t>
             </w:r>
             <w:proofErr w:type="spellStart"/>
             <w:r>
@@ -2295,7 +3464,7 @@
                 <w:szCs w:val="20"/>
                 <w:lang w:eastAsia="es-CL"/>
               </w:rPr>
-              <w:t>) aisladas, como la de Maicao, y desarrollando colas de revisión manual (</w:t>
+              <w:t xml:space="preserve">) aisladas para validar la extracción (ej. </w:t>
             </w:r>
             <w:proofErr w:type="spellStart"/>
             <w:r>
@@ -2308,7 +3477,7 @@
                 <w:szCs w:val="20"/>
                 <w:lang w:eastAsia="es-CL"/>
               </w:rPr>
-              <w:t>review_queue</w:t>
+              <w:t>PoC</w:t>
             </w:r>
             <w:proofErr w:type="spellEnd"/>
             <w:r>
@@ -2321,63 +3490,60 @@
                 <w:szCs w:val="20"/>
                 <w:lang w:eastAsia="es-CL"/>
               </w:rPr>
-              <w:t>) para asegurar que el cruce de datos y los identificadores estables funcionen correctamente antes de escalar el volumen de consultas.</w:t>
-            </w:r>
-          </w:p>
-          <w:p>
-            <w:pPr>
-              <w:rPr>
-                <w:rFonts w:ascii="Calibri" w:hAnsi="Calibri"/>
-                <w:color w:val="1F3864" w:themeColor="accent1" w:themeShade="80"/>
-              </w:rPr>
-            </w:pPr>
-          </w:p>
-          <w:p>
-            <w:pPr>
-              <w:rPr>
-                <w:rFonts w:ascii="Calibri" w:hAnsi="Calibri"/>
-                <w:color w:val="1F3864" w:themeColor="accent1" w:themeShade="80"/>
-              </w:rPr>
-            </w:pPr>
-          </w:p>
-          <w:p>
-            <w:pPr>
-              <w:jc w:val="both"/>
-              <w:rPr>
-                <w:rFonts w:ascii="Calibri" w:hAnsi="Calibri" w:cs="Arial"/>
-                <w:i/>
-                <w:color w:val="548DD4"/>
-                <w:sz w:val="20"/>
-                <w:szCs w:val="20"/>
-                <w:lang w:eastAsia="es-CL"/>
-              </w:rPr>
-            </w:pPr>
-          </w:p>
-          <w:p>
-            <w:pPr>
-              <w:jc w:val="both"/>
-              <w:rPr>
-                <w:rFonts w:ascii="Calibri" w:hAnsi="Calibri" w:cs="Arial"/>
-                <w:i/>
-                <w:color w:val="548DD4"/>
-                <w:sz w:val="20"/>
-                <w:szCs w:val="20"/>
-                <w:lang w:eastAsia="es-CL"/>
-              </w:rPr>
-            </w:pPr>
-          </w:p>
-          <w:p>
-            <w:pPr>
-              <w:jc w:val="both"/>
-              <w:rPr>
-                <w:rFonts w:ascii="Calibri" w:hAnsi="Calibri" w:cs="Arial"/>
-                <w:i/>
-                <w:color w:val="548DD4"/>
-                <w:sz w:val="20"/>
-                <w:szCs w:val="20"/>
-                <w:lang w:eastAsia="es-CL"/>
-              </w:rPr>
-            </w:pPr>
+              <w:t xml:space="preserve"> Maicao) y diseñamos una cola de revisión de datos (</w:t>
+            </w:r>
+            <w:proofErr w:type="spellStart"/>
+            <w:r>
+              <w:rPr>
+                <w:rFonts w:ascii="Calibri" w:hAnsi="Calibri" w:cs="Arial"/>
+                <w:i/>
+                <w:iCs/>
+                <w:color w:val="548DD4"/>
+                <w:sz w:val="20"/>
+                <w:szCs w:val="20"/>
+                <w:lang w:eastAsia="es-CL"/>
+              </w:rPr>
+              <w:t>review</w:t>
+            </w:r>
+            <w:proofErr w:type="spellEnd"/>
+            <w:r>
+              <w:rPr>
+                <w:rFonts w:ascii="Calibri" w:hAnsi="Calibri" w:cs="Arial"/>
+                <w:i/>
+                <w:iCs/>
+                <w:color w:val="548DD4"/>
+                <w:sz w:val="20"/>
+                <w:szCs w:val="20"/>
+                <w:lang w:eastAsia="es-CL"/>
+              </w:rPr>
+              <w:t xml:space="preserve"> </w:t>
+            </w:r>
+            <w:proofErr w:type="spellStart"/>
+            <w:r>
+              <w:rPr>
+                <w:rFonts w:ascii="Calibri" w:hAnsi="Calibri" w:cs="Arial"/>
+                <w:i/>
+                <w:iCs/>
+                <w:color w:val="548DD4"/>
+                <w:sz w:val="20"/>
+                <w:szCs w:val="20"/>
+                <w:lang w:eastAsia="es-CL"/>
+              </w:rPr>
+              <w:t>queue</w:t>
+            </w:r>
+            <w:proofErr w:type="spellEnd"/>
+            <w:r>
+              <w:rPr>
+                <w:rFonts w:ascii="Calibri" w:hAnsi="Calibri" w:cs="Arial"/>
+                <w:i/>
+                <w:iCs/>
+                <w:color w:val="548DD4"/>
+                <w:sz w:val="20"/>
+                <w:szCs w:val="20"/>
+                <w:lang w:eastAsia="es-CL"/>
+              </w:rPr>
+              <w:t>) acompañada de la bitácora known_data_issues.md para garantizar la calidad antes del almacenamiento masivo.</w:t>
+            </w:r>
           </w:p>
         </w:tc>
       </w:tr>
@@ -2390,316 +3556,6 @@
           <w:sz w:val="24"/>
           <w:szCs w:val="24"/>
           <w:lang w:val="es-ES"/>
-        </w:rPr>
-      </w:pPr>
-    </w:p>
-    <w:tbl>
-      <w:tblPr>
-        <w:tblStyle w:val="Tablaconcuadrcula"/>
-        <w:tblpPr w:leftFromText="180" w:rightFromText="180" w:vertAnchor="text" w:horzAnchor="margin" w:tblpX="-572" w:tblpY="107"/>
-        <w:tblW w:w="5588" w:type="pct"/>
-        <w:tblBorders>
-          <w:top w:val="single" w:sz="4" w:space="0" w:color="BFBFBF" w:themeColor="background1" w:themeShade="BF"/>
-          <w:left w:val="single" w:sz="4" w:space="0" w:color="BFBFBF" w:themeColor="background1" w:themeShade="BF"/>
-          <w:bottom w:val="single" w:sz="4" w:space="0" w:color="BFBFBF" w:themeColor="background1" w:themeShade="BF"/>
-          <w:right w:val="single" w:sz="4" w:space="0" w:color="BFBFBF" w:themeColor="background1" w:themeShade="BF"/>
-          <w:insideH w:val="single" w:sz="4" w:space="0" w:color="BFBFBF" w:themeColor="background1" w:themeShade="BF"/>
-          <w:insideV w:val="single" w:sz="4" w:space="0" w:color="BFBFBF" w:themeColor="background1" w:themeShade="BF"/>
-        </w:tblBorders>
-        <w:tblLook w:val="04A0" w:firstRow="1" w:lastRow="0" w:firstColumn="1" w:lastColumn="0" w:noHBand="0" w:noVBand="1"/>
-      </w:tblPr>
-      <w:tblGrid>
-        <w:gridCol w:w="9493"/>
-      </w:tblGrid>
-      <w:tr>
-        <w:trPr>
-          <w:trHeight w:val="1936"/>
-        </w:trPr>
-        <w:tc>
-          <w:tcPr>
-            <w:tcW w:w="5000" w:type="pct"/>
-            <w:vAlign w:val="center"/>
-          </w:tcPr>
-          <w:p>
-            <w:pPr>
-              <w:jc w:val="both"/>
-              <w:rPr>
-                <w:rFonts w:ascii="Calibri" w:hAnsi="Calibri" w:cs="Arial"/>
-                <w:i/>
-                <w:color w:val="548DD4"/>
-                <w:sz w:val="20"/>
-                <w:szCs w:val="20"/>
-                <w:lang w:eastAsia="es-CL"/>
-              </w:rPr>
-            </w:pPr>
-            <w:r>
-              <w:rPr>
-                <w:rFonts w:ascii="Calibri" w:hAnsi="Calibri"/>
-                <w:color w:val="1F3864" w:themeColor="accent1" w:themeShade="80"/>
-              </w:rPr>
-              <w:t xml:space="preserve">Actividades ajustadas o eliminadas: </w:t>
-            </w:r>
-            <w:r>
-              <w:rPr>
-                <w:rFonts w:ascii="Calibri" w:hAnsi="Calibri" w:cs="Arial"/>
-                <w:i/>
-                <w:color w:val="548DD4"/>
-                <w:sz w:val="20"/>
-                <w:szCs w:val="20"/>
-                <w:lang w:eastAsia="es-CL"/>
-              </w:rPr>
-              <w:t>No se ha eliminado ninguna actividad, pero se realizó un ajuste metodológico en la "Integración del Módulo de IA". En lugar de conectar directamente la API en la primera iteración, decidimos construir y etiquetar de forma extensiva un conjunto de datos (</w:t>
-            </w:r>
-            <w:proofErr w:type="spellStart"/>
-            <w:r>
-              <w:rPr>
-                <w:rFonts w:ascii="Calibri" w:hAnsi="Calibri" w:cs="Arial"/>
-                <w:i/>
-                <w:color w:val="548DD4"/>
-                <w:sz w:val="20"/>
-                <w:szCs w:val="20"/>
-                <w:lang w:eastAsia="es-CL"/>
-              </w:rPr>
-              <w:t>datasets</w:t>
-            </w:r>
-            <w:proofErr w:type="spellEnd"/>
-            <w:r>
-              <w:rPr>
-                <w:rFonts w:ascii="Calibri" w:hAnsi="Calibri" w:cs="Arial"/>
-                <w:i/>
-                <w:color w:val="548DD4"/>
-                <w:sz w:val="20"/>
-                <w:szCs w:val="20"/>
-                <w:lang w:eastAsia="es-CL"/>
-              </w:rPr>
-              <w:t xml:space="preserve"> de </w:t>
-            </w:r>
-            <w:proofErr w:type="spellStart"/>
-            <w:r>
-              <w:rPr>
-                <w:rFonts w:ascii="Calibri" w:hAnsi="Calibri" w:cs="Arial"/>
-                <w:i/>
-                <w:color w:val="548DD4"/>
-                <w:sz w:val="20"/>
-                <w:szCs w:val="20"/>
-                <w:lang w:eastAsia="es-CL"/>
-              </w:rPr>
-              <w:t>matching</w:t>
-            </w:r>
-            <w:proofErr w:type="spellEnd"/>
-            <w:r>
-              <w:rPr>
-                <w:rFonts w:ascii="Calibri" w:hAnsi="Calibri" w:cs="Arial"/>
-                <w:i/>
-                <w:color w:val="548DD4"/>
-                <w:sz w:val="20"/>
-                <w:szCs w:val="20"/>
-                <w:lang w:eastAsia="es-CL"/>
-              </w:rPr>
-              <w:t xml:space="preserve"> y referencias de cadenas) para validar de manera robusta el modelo de coincidencia (</w:t>
-            </w:r>
-            <w:proofErr w:type="spellStart"/>
-            <w:r>
-              <w:rPr>
-                <w:rFonts w:ascii="Calibri" w:hAnsi="Calibri" w:cs="Arial"/>
-                <w:i/>
-                <w:color w:val="548DD4"/>
-                <w:sz w:val="20"/>
-                <w:szCs w:val="20"/>
-                <w:lang w:eastAsia="es-CL"/>
-              </w:rPr>
-              <w:t>matching</w:t>
-            </w:r>
-            <w:proofErr w:type="spellEnd"/>
-            <w:r>
-              <w:rPr>
-                <w:rFonts w:ascii="Calibri" w:hAnsi="Calibri" w:cs="Arial"/>
-                <w:i/>
-                <w:color w:val="548DD4"/>
-                <w:sz w:val="20"/>
-                <w:szCs w:val="20"/>
-                <w:lang w:eastAsia="es-CL"/>
-              </w:rPr>
-              <w:t xml:space="preserve"> </w:t>
-            </w:r>
-            <w:proofErr w:type="spellStart"/>
-            <w:r>
-              <w:rPr>
-                <w:rFonts w:ascii="Calibri" w:hAnsi="Calibri" w:cs="Arial"/>
-                <w:i/>
-                <w:color w:val="548DD4"/>
-                <w:sz w:val="20"/>
-                <w:szCs w:val="20"/>
-                <w:lang w:eastAsia="es-CL"/>
-              </w:rPr>
-              <w:t>evaluation</w:t>
-            </w:r>
-            <w:proofErr w:type="spellEnd"/>
-            <w:r>
-              <w:rPr>
-                <w:rFonts w:ascii="Calibri" w:hAnsi="Calibri" w:cs="Arial"/>
-                <w:i/>
-                <w:color w:val="548DD4"/>
-                <w:sz w:val="20"/>
-                <w:szCs w:val="20"/>
-                <w:lang w:eastAsia="es-CL"/>
-              </w:rPr>
-              <w:t xml:space="preserve">) de productos entre diferentes tiendas (ej. </w:t>
-            </w:r>
-            <w:proofErr w:type="spellStart"/>
-            <w:r>
-              <w:rPr>
-                <w:rFonts w:ascii="Calibri" w:hAnsi="Calibri" w:cs="Arial"/>
-                <w:i/>
-                <w:color w:val="548DD4"/>
-                <w:sz w:val="20"/>
-                <w:szCs w:val="20"/>
-                <w:lang w:eastAsia="es-CL"/>
-              </w:rPr>
-              <w:t>Salcobrand</w:t>
-            </w:r>
-            <w:proofErr w:type="spellEnd"/>
-            <w:r>
-              <w:rPr>
-                <w:rFonts w:ascii="Calibri" w:hAnsi="Calibri" w:cs="Arial"/>
-                <w:i/>
-                <w:color w:val="548DD4"/>
-                <w:sz w:val="20"/>
-                <w:szCs w:val="20"/>
-                <w:lang w:eastAsia="es-CL"/>
-              </w:rPr>
-              <w:t xml:space="preserve">). Esto garantiza que el </w:t>
-            </w:r>
-            <w:proofErr w:type="spellStart"/>
-            <w:r>
-              <w:rPr>
-                <w:rFonts w:ascii="Calibri" w:hAnsi="Calibri" w:cs="Arial"/>
-                <w:i/>
-                <w:color w:val="548DD4"/>
-                <w:sz w:val="20"/>
-                <w:szCs w:val="20"/>
-                <w:lang w:eastAsia="es-CL"/>
-              </w:rPr>
-              <w:t>recomendador</w:t>
-            </w:r>
-            <w:proofErr w:type="spellEnd"/>
-            <w:r>
-              <w:rPr>
-                <w:rFonts w:ascii="Calibri" w:hAnsi="Calibri" w:cs="Arial"/>
-                <w:i/>
-                <w:color w:val="548DD4"/>
-                <w:sz w:val="20"/>
-                <w:szCs w:val="20"/>
-                <w:lang w:eastAsia="es-CL"/>
-              </w:rPr>
-              <w:t xml:space="preserve"> tenga una base de datos limpia y unificada antes del despliegue en la interfaz.</w:t>
-            </w:r>
-          </w:p>
-          <w:p>
-            <w:pPr>
-              <w:jc w:val="both"/>
-              <w:rPr>
-                <w:rFonts w:ascii="Calibri" w:hAnsi="Calibri" w:cs="Arial"/>
-                <w:i/>
-                <w:color w:val="548DD4"/>
-                <w:sz w:val="20"/>
-                <w:szCs w:val="20"/>
-                <w:lang w:eastAsia="es-CL"/>
-              </w:rPr>
-            </w:pPr>
-          </w:p>
-          <w:p>
-            <w:pPr>
-              <w:jc w:val="both"/>
-              <w:rPr>
-                <w:rFonts w:ascii="Calibri" w:hAnsi="Calibri" w:cs="Arial"/>
-                <w:i/>
-                <w:color w:val="C00000"/>
-                <w:sz w:val="20"/>
-                <w:szCs w:val="20"/>
-                <w:lang w:eastAsia="es-CL"/>
-              </w:rPr>
-            </w:pPr>
-          </w:p>
-          <w:p>
-            <w:pPr>
-              <w:jc w:val="both"/>
-              <w:rPr>
-                <w:rFonts w:ascii="Calibri" w:hAnsi="Calibri" w:cs="Arial"/>
-                <w:i/>
-                <w:color w:val="548DD4"/>
-                <w:sz w:val="20"/>
-                <w:szCs w:val="20"/>
-                <w:lang w:eastAsia="es-CL"/>
-              </w:rPr>
-            </w:pPr>
-          </w:p>
-          <w:p>
-            <w:pPr>
-              <w:jc w:val="both"/>
-              <w:rPr>
-                <w:rFonts w:ascii="Calibri" w:hAnsi="Calibri" w:cs="Arial"/>
-                <w:i/>
-                <w:color w:val="548DD4"/>
-                <w:sz w:val="20"/>
-                <w:szCs w:val="20"/>
-                <w:lang w:eastAsia="es-CL"/>
-              </w:rPr>
-            </w:pPr>
-          </w:p>
-          <w:p>
-            <w:pPr>
-              <w:jc w:val="both"/>
-              <w:rPr>
-                <w:rFonts w:ascii="Calibri" w:hAnsi="Calibri" w:cs="Arial"/>
-                <w:i/>
-                <w:color w:val="548DD4"/>
-                <w:sz w:val="20"/>
-                <w:szCs w:val="20"/>
-                <w:lang w:eastAsia="es-CL"/>
-              </w:rPr>
-            </w:pPr>
-          </w:p>
-          <w:p>
-            <w:pPr>
-              <w:jc w:val="both"/>
-              <w:rPr>
-                <w:rFonts w:ascii="Calibri" w:hAnsi="Calibri" w:cs="Arial"/>
-                <w:i/>
-                <w:color w:val="548DD4"/>
-                <w:sz w:val="20"/>
-                <w:szCs w:val="20"/>
-                <w:lang w:eastAsia="es-CL"/>
-              </w:rPr>
-            </w:pPr>
-          </w:p>
-          <w:p>
-            <w:pPr>
-              <w:jc w:val="both"/>
-              <w:rPr>
-                <w:rFonts w:ascii="Calibri" w:hAnsi="Calibri" w:cs="Arial"/>
-                <w:i/>
-                <w:color w:val="548DD4"/>
-                <w:sz w:val="20"/>
-                <w:szCs w:val="20"/>
-                <w:lang w:eastAsia="es-CL"/>
-              </w:rPr>
-            </w:pPr>
-          </w:p>
-        </w:tc>
-      </w:tr>
-    </w:tbl>
-    <w:p>
-      <w:pPr>
-        <w:spacing w:after="0" w:line="240" w:lineRule="auto"/>
-        <w:jc w:val="both"/>
-        <w:rPr>
-          <w:rFonts w:ascii="Calibri" w:hAnsi="Calibri" w:cs="Arial"/>
-          <w:i/>
-          <w:color w:val="548DD4"/>
-          <w:sz w:val="20"/>
-          <w:szCs w:val="20"/>
-          <w:lang w:eastAsia="es-CL"/>
         </w:rPr>
       </w:pPr>
     </w:p>
@@ -2720,8 +3576,240 @@
     <w:tbl>
       <w:tblPr>
         <w:tblStyle w:val="Tablaconcuadrcula"/>
+        <w:tblpPr w:leftFromText="180" w:rightFromText="180" w:vertAnchor="text" w:horzAnchor="margin" w:tblpXSpec="center" w:tblpY="-57"/>
+        <w:tblW w:w="5562" w:type="pct"/>
+        <w:tblBorders>
+          <w:top w:val="single" w:sz="4" w:space="0" w:color="BFBFBF" w:themeColor="background1" w:themeShade="BF"/>
+          <w:left w:val="single" w:sz="4" w:space="0" w:color="BFBFBF" w:themeColor="background1" w:themeShade="BF"/>
+          <w:bottom w:val="single" w:sz="4" w:space="0" w:color="BFBFBF" w:themeColor="background1" w:themeShade="BF"/>
+          <w:right w:val="single" w:sz="4" w:space="0" w:color="BFBFBF" w:themeColor="background1" w:themeShade="BF"/>
+          <w:insideH w:val="single" w:sz="4" w:space="0" w:color="BFBFBF" w:themeColor="background1" w:themeShade="BF"/>
+          <w:insideV w:val="single" w:sz="4" w:space="0" w:color="BFBFBF" w:themeColor="background1" w:themeShade="BF"/>
+        </w:tblBorders>
+        <w:tblLook w:val="04A0" w:firstRow="1" w:lastRow="0" w:firstColumn="1" w:lastColumn="0" w:noHBand="0" w:noVBand="1"/>
+      </w:tblPr>
+      <w:tblGrid>
+        <w:gridCol w:w="9449"/>
+      </w:tblGrid>
+      <w:tr>
+        <w:trPr>
+          <w:trHeight w:val="759"/>
+        </w:trPr>
+        <w:tc>
+          <w:tcPr>
+            <w:tcW w:w="5000" w:type="pct"/>
+            <w:vAlign w:val="center"/>
+          </w:tcPr>
+          <w:p>
+            <w:pPr>
+              <w:jc w:val="both"/>
+              <w:rPr>
+                <w:rFonts w:ascii="Calibri" w:hAnsi="Calibri" w:cs="Arial"/>
+                <w:i/>
+                <w:color w:val="548DD4"/>
+                <w:sz w:val="20"/>
+                <w:szCs w:val="20"/>
+                <w:lang w:eastAsia="es-CL"/>
+              </w:rPr>
+            </w:pPr>
+            <w:r>
+              <w:rPr>
+                <w:rFonts w:ascii="Calibri" w:hAnsi="Calibri"/>
+                <w:color w:val="1F3864" w:themeColor="accent1" w:themeShade="80"/>
+              </w:rPr>
+              <w:t>Actividades ajustadas o eliminadas</w:t>
+            </w:r>
+            <w:proofErr w:type="gramStart"/>
+            <w:r>
+              <w:rPr>
+                <w:rFonts w:ascii="Calibri" w:hAnsi="Calibri"/>
+                <w:color w:val="1F3864" w:themeColor="accent1" w:themeShade="80"/>
+              </w:rPr>
+              <w:t xml:space="preserve">: </w:t>
+            </w:r>
+            <w:r>
+              <w:t xml:space="preserve"> </w:t>
+            </w:r>
+            <w:r>
+              <w:rPr>
+                <w:rFonts w:ascii="Calibri" w:hAnsi="Calibri" w:cs="Arial"/>
+                <w:i/>
+                <w:color w:val="548DD4"/>
+                <w:sz w:val="20"/>
+                <w:szCs w:val="20"/>
+                <w:lang w:eastAsia="es-CL"/>
+              </w:rPr>
+              <w:t>No</w:t>
+            </w:r>
+            <w:proofErr w:type="gramEnd"/>
+            <w:r>
+              <w:rPr>
+                <w:rFonts w:ascii="Calibri" w:hAnsi="Calibri" w:cs="Arial"/>
+                <w:i/>
+                <w:color w:val="548DD4"/>
+                <w:sz w:val="20"/>
+                <w:szCs w:val="20"/>
+                <w:lang w:eastAsia="es-CL"/>
+              </w:rPr>
+              <w:t xml:space="preserve"> se eliminó ninguna actividad del plan inicial. Sin embargo, se realizó un ajuste metodológico en la actividad N° 4 ("Integración del Módulo de IA"):</w:t>
+            </w:r>
+            <w:r>
+              <w:t xml:space="preserve"> </w:t>
+            </w:r>
+            <w:r>
+              <w:rPr>
+                <w:rFonts w:ascii="Calibri" w:hAnsi="Calibri" w:cs="Arial"/>
+                <w:i/>
+                <w:color w:val="548DD4"/>
+                <w:sz w:val="20"/>
+                <w:szCs w:val="20"/>
+                <w:lang w:eastAsia="es-CL"/>
+              </w:rPr>
+              <w:t xml:space="preserve">n lugar de proceder directamente a la conexión con las </w:t>
+            </w:r>
+            <w:proofErr w:type="spellStart"/>
+            <w:r>
+              <w:rPr>
+                <w:rFonts w:ascii="Calibri" w:hAnsi="Calibri" w:cs="Arial"/>
+                <w:i/>
+                <w:color w:val="548DD4"/>
+                <w:sz w:val="20"/>
+                <w:szCs w:val="20"/>
+                <w:lang w:eastAsia="es-CL"/>
+              </w:rPr>
+              <w:t>APIs</w:t>
+            </w:r>
+            <w:proofErr w:type="spellEnd"/>
+            <w:r>
+              <w:rPr>
+                <w:rFonts w:ascii="Calibri" w:hAnsi="Calibri" w:cs="Arial"/>
+                <w:i/>
+                <w:color w:val="548DD4"/>
+                <w:sz w:val="20"/>
+                <w:szCs w:val="20"/>
+                <w:lang w:eastAsia="es-CL"/>
+              </w:rPr>
+              <w:t xml:space="preserve"> de IA, se priorizó la construcción, estructuración y etiquetado de un conjunto de datos extenso (</w:t>
+            </w:r>
+            <w:proofErr w:type="spellStart"/>
+            <w:r>
+              <w:rPr>
+                <w:rFonts w:ascii="Calibri" w:hAnsi="Calibri" w:cs="Arial"/>
+                <w:i/>
+                <w:color w:val="548DD4"/>
+                <w:sz w:val="20"/>
+                <w:szCs w:val="20"/>
+                <w:lang w:eastAsia="es-CL"/>
+              </w:rPr>
+              <w:t>matching</w:t>
+            </w:r>
+            <w:proofErr w:type="spellEnd"/>
+            <w:r>
+              <w:rPr>
+                <w:rFonts w:ascii="Calibri" w:hAnsi="Calibri" w:cs="Arial"/>
+                <w:i/>
+                <w:color w:val="548DD4"/>
+                <w:sz w:val="20"/>
+                <w:szCs w:val="20"/>
+                <w:lang w:eastAsia="es-CL"/>
+              </w:rPr>
+              <w:t xml:space="preserve"> </w:t>
+            </w:r>
+            <w:proofErr w:type="spellStart"/>
+            <w:r>
+              <w:rPr>
+                <w:rFonts w:ascii="Calibri" w:hAnsi="Calibri" w:cs="Arial"/>
+                <w:i/>
+                <w:color w:val="548DD4"/>
+                <w:sz w:val="20"/>
+                <w:szCs w:val="20"/>
+                <w:lang w:eastAsia="es-CL"/>
+              </w:rPr>
+              <w:t>evaluation</w:t>
+            </w:r>
+            <w:proofErr w:type="spellEnd"/>
+            <w:r>
+              <w:rPr>
+                <w:rFonts w:ascii="Calibri" w:hAnsi="Calibri" w:cs="Arial"/>
+                <w:i/>
+                <w:color w:val="548DD4"/>
+                <w:sz w:val="20"/>
+                <w:szCs w:val="20"/>
+                <w:lang w:eastAsia="es-CL"/>
+              </w:rPr>
+              <w:t xml:space="preserve"> </w:t>
+            </w:r>
+            <w:proofErr w:type="spellStart"/>
+            <w:r>
+              <w:rPr>
+                <w:rFonts w:ascii="Calibri" w:hAnsi="Calibri" w:cs="Arial"/>
+                <w:i/>
+                <w:color w:val="548DD4"/>
+                <w:sz w:val="20"/>
+                <w:szCs w:val="20"/>
+                <w:lang w:eastAsia="es-CL"/>
+              </w:rPr>
+              <w:t>datasets</w:t>
+            </w:r>
+            <w:proofErr w:type="spellEnd"/>
+            <w:r>
+              <w:rPr>
+                <w:rFonts w:ascii="Calibri" w:hAnsi="Calibri" w:cs="Arial"/>
+                <w:i/>
+                <w:color w:val="548DD4"/>
+                <w:sz w:val="20"/>
+                <w:szCs w:val="20"/>
+                <w:lang w:eastAsia="es-CL"/>
+              </w:rPr>
+              <w:t xml:space="preserve"> en data/</w:t>
+            </w:r>
+            <w:proofErr w:type="spellStart"/>
+            <w:r>
+              <w:rPr>
+                <w:rFonts w:ascii="Calibri" w:hAnsi="Calibri" w:cs="Arial"/>
+                <w:i/>
+                <w:color w:val="548DD4"/>
+                <w:sz w:val="20"/>
+                <w:szCs w:val="20"/>
+                <w:lang w:eastAsia="es-CL"/>
+              </w:rPr>
+              <w:t>labeled</w:t>
+            </w:r>
+            <w:proofErr w:type="spellEnd"/>
+            <w:r>
+              <w:rPr>
+                <w:rFonts w:ascii="Calibri" w:hAnsi="Calibri" w:cs="Arial"/>
+                <w:i/>
+                <w:color w:val="548DD4"/>
+                <w:sz w:val="20"/>
+                <w:szCs w:val="20"/>
+                <w:lang w:eastAsia="es-CL"/>
+              </w:rPr>
+              <w:t>/). Esto asegura que el algoritmo de recomendación y coincidencia de productos cuente con un catálogo limpio, homologado y fiable antes de exponer las recomendaciones en la interfaz web/móvil.</w:t>
+            </w:r>
+          </w:p>
+        </w:tc>
+      </w:tr>
+    </w:tbl>
+    <w:p>
+      <w:pPr>
+        <w:spacing w:after="0" w:line="240" w:lineRule="auto"/>
+        <w:jc w:val="both"/>
+        <w:rPr>
+          <w:rFonts w:ascii="Calibri" w:hAnsi="Calibri" w:cs="Arial"/>
+          <w:i/>
+          <w:color w:val="548DD4"/>
+          <w:sz w:val="20"/>
+          <w:szCs w:val="20"/>
+          <w:lang w:eastAsia="es-CL"/>
+        </w:rPr>
+      </w:pPr>
+    </w:p>
+    <w:tbl>
+      <w:tblPr>
+        <w:tblStyle w:val="Tablaconcuadrcula"/>
+        <w:tblpPr w:leftFromText="141" w:rightFromText="141" w:vertAnchor="text" w:horzAnchor="margin" w:tblpXSpec="center" w:tblpY="1675"/>
         <w:tblW w:w="5591" w:type="pct"/>
-        <w:tblInd w:w="-572" w:type="dxa"/>
         <w:tblBorders>
           <w:top w:val="single" w:sz="4" w:space="0" w:color="BFBFBF" w:themeColor="background1" w:themeShade="BF"/>
           <w:left w:val="single" w:sz="4" w:space="0" w:color="BFBFBF" w:themeColor="background1" w:themeShade="BF"/>
@@ -2775,15 +3863,29 @@
               <w:t xml:space="preserve"> </w:t>
             </w:r>
             <w:r>
-              <w:rPr>
-                <w:rFonts w:ascii="Calibri" w:hAnsi="Calibri" w:cs="Arial"/>
-                <w:i/>
-                <w:color w:val="548DD4"/>
-                <w:sz w:val="20"/>
-                <w:szCs w:val="20"/>
-                <w:lang w:eastAsia="es-CL"/>
-              </w:rPr>
-              <w:t xml:space="preserve">Las actividades relacionadas con el "Desarrollo de la Interfaz </w:t>
+              <w:t xml:space="preserve"> </w:t>
+            </w:r>
+            <w:r>
+              <w:rPr>
+                <w:rFonts w:ascii="Calibri" w:hAnsi="Calibri" w:cs="Arial"/>
+                <w:i/>
+                <w:color w:val="548DD4"/>
+                <w:sz w:val="20"/>
+                <w:szCs w:val="20"/>
+                <w:lang w:eastAsia="es-CL"/>
+              </w:rPr>
+              <w:t xml:space="preserve">Desarrollo de </w:t>
+            </w:r>
+            <w:r>
+              <w:rPr>
+                <w:rFonts w:ascii="Calibri" w:hAnsi="Calibri" w:cs="Arial"/>
+                <w:i/>
+                <w:color w:val="548DD4"/>
+                <w:sz w:val="20"/>
+                <w:szCs w:val="20"/>
+                <w:lang w:eastAsia="es-CL"/>
+              </w:rPr>
+              <w:t xml:space="preserve">la Interfaz </w:t>
             </w:r>
             <w:proofErr w:type="spellStart"/>
             <w:r>
@@ -2807,7 +3909,66 @@
                 <w:szCs w:val="20"/>
                 <w:lang w:eastAsia="es-CL"/>
               </w:rPr>
-              <w:t xml:space="preserve"> Web y Móvil" y "Pruebas QA, Despliegue y Cierre" se encuentran en estado "No iniciado". No obstante, esto no constituye un retraso, ya que de acuerdo a la planificación de 18 semanas, estas etapas están programadas para comenzar a partir de la Semana 13 y Semana 16 respectivamente. El núcleo </w:t>
+              <w:t xml:space="preserve"> Web y Móvil</w:t>
+            </w:r>
+          </w:p>
+          <w:p>
+            <w:pPr>
+              <w:jc w:val="both"/>
+              <w:rPr>
+                <w:rFonts w:ascii="Calibri" w:hAnsi="Calibri" w:cs="Arial"/>
+                <w:i/>
+                <w:color w:val="548DD4"/>
+                <w:sz w:val="20"/>
+                <w:szCs w:val="20"/>
+                <w:lang w:eastAsia="es-CL"/>
+              </w:rPr>
+            </w:pPr>
+            <w:r>
+              <w:rPr>
+                <w:rFonts w:ascii="Calibri" w:hAnsi="Calibri" w:cs="Arial"/>
+                <w:i/>
+                <w:color w:val="548DD4"/>
+                <w:sz w:val="20"/>
+                <w:szCs w:val="20"/>
+                <w:lang w:eastAsia="es-CL"/>
+              </w:rPr>
+              <w:t>Pruebas QA, Despliegue CI/CD y Cierre del Proyecto</w:t>
+            </w:r>
+            <w:r>
+              <w:rPr>
+                <w:rFonts w:ascii="Calibri" w:hAnsi="Calibri" w:cs="Arial"/>
+                <w:i/>
+                <w:color w:val="548DD4"/>
+                <w:sz w:val="20"/>
+                <w:szCs w:val="20"/>
+                <w:lang w:eastAsia="es-CL"/>
+              </w:rPr>
+              <w:t>.</w:t>
+            </w:r>
+          </w:p>
+          <w:p>
+            <w:pPr>
+              <w:jc w:val="both"/>
+              <w:rPr>
+                <w:rFonts w:ascii="Calibri" w:hAnsi="Calibri" w:cs="Arial"/>
+                <w:i/>
+                <w:color w:val="548DD4"/>
+                <w:sz w:val="20"/>
+                <w:szCs w:val="20"/>
+                <w:lang w:eastAsia="es-CL"/>
+              </w:rPr>
+            </w:pPr>
+            <w:r>
+              <w:rPr>
+                <w:rFonts w:ascii="Calibri" w:hAnsi="Calibri" w:cs="Arial"/>
+                <w:i/>
+                <w:color w:val="548DD4"/>
+                <w:sz w:val="20"/>
+                <w:szCs w:val="20"/>
+                <w:lang w:eastAsia="es-CL"/>
+              </w:rPr>
+              <w:t xml:space="preserve">Justificación: Ninguna de estas dos actividades presenta un retraso funcional ni crítico. De acuerdo con la Carta Gantt trazada para el semestre de 18 semanas, la construcción de la interfaz gráfica está </w:t>
             </w:r>
             <w:proofErr w:type="spellStart"/>
             <w:r>
@@ -2819,6 +3980,30 @@
                 <w:szCs w:val="20"/>
                 <w:lang w:eastAsia="es-CL"/>
               </w:rPr>
+              <w:t>agendada</w:t>
+            </w:r>
+            <w:proofErr w:type="spellEnd"/>
+            <w:r>
+              <w:rPr>
+                <w:rFonts w:ascii="Calibri" w:hAnsi="Calibri" w:cs="Arial"/>
+                <w:i/>
+                <w:color w:val="548DD4"/>
+                <w:sz w:val="20"/>
+                <w:szCs w:val="20"/>
+                <w:lang w:eastAsia="es-CL"/>
+              </w:rPr>
+              <w:t xml:space="preserve"> para el bloque de las Semanas 13 a 15, mientras que las pruebas finales y el despliegue se realizarán entre las Semanas 16 y 18. El trabajo enfocado en el </w:t>
+            </w:r>
+            <w:proofErr w:type="spellStart"/>
+            <w:r>
+              <w:rPr>
+                <w:rFonts w:ascii="Calibri" w:hAnsi="Calibri" w:cs="Arial"/>
+                <w:i/>
+                <w:color w:val="548DD4"/>
+                <w:sz w:val="20"/>
+                <w:szCs w:val="20"/>
+                <w:lang w:eastAsia="es-CL"/>
+              </w:rPr>
               <w:t>backend</w:t>
             </w:r>
             <w:proofErr w:type="spellEnd"/>
@@ -2831,7 +4016,7 @@
                 <w:szCs w:val="20"/>
                 <w:lang w:eastAsia="es-CL"/>
               </w:rPr>
-              <w:t xml:space="preserve"> y de datos (API, </w:t>
+              <w:t xml:space="preserve">, la extracción y la calidad de los datos permite asegurar que el </w:t>
             </w:r>
             <w:proofErr w:type="spellStart"/>
             <w:r>
@@ -2843,7 +4028,7 @@
                 <w:szCs w:val="20"/>
                 <w:lang w:eastAsia="es-CL"/>
               </w:rPr>
-              <w:t>scraping</w:t>
+              <w:t>frontend</w:t>
             </w:r>
             <w:proofErr w:type="spellEnd"/>
             <w:r>
@@ -2855,110 +4040,10 @@
                 <w:szCs w:val="20"/>
                 <w:lang w:eastAsia="es-CL"/>
               </w:rPr>
-              <w:t xml:space="preserve"> y bases de datos) está avanzando sólidamente para soportar el inicio del </w:t>
-            </w:r>
-            <w:proofErr w:type="spellStart"/>
-            <w:r>
-              <w:rPr>
-                <w:rFonts w:ascii="Calibri" w:hAnsi="Calibri" w:cs="Arial"/>
-                <w:i/>
-                <w:color w:val="548DD4"/>
-                <w:sz w:val="20"/>
-                <w:szCs w:val="20"/>
-                <w:lang w:eastAsia="es-CL"/>
-              </w:rPr>
-              <w:t>frontend</w:t>
-            </w:r>
-            <w:proofErr w:type="spellEnd"/>
-            <w:r>
-              <w:rPr>
-                <w:rFonts w:ascii="Calibri" w:hAnsi="Calibri" w:cs="Arial"/>
-                <w:i/>
-                <w:color w:val="548DD4"/>
-                <w:sz w:val="20"/>
-                <w:szCs w:val="20"/>
-                <w:lang w:eastAsia="es-CL"/>
-              </w:rPr>
-              <w:t xml:space="preserve"> sin bloqueos técnicos.</w:t>
-            </w:r>
-          </w:p>
-          <w:p>
-            <w:pPr>
-              <w:jc w:val="both"/>
-              <w:rPr>
-                <w:rFonts w:ascii="Calibri" w:hAnsi="Calibri" w:cs="Arial"/>
-                <w:i/>
-                <w:color w:val="548DD4"/>
-                <w:sz w:val="20"/>
-                <w:szCs w:val="20"/>
-                <w:lang w:eastAsia="es-CL"/>
-              </w:rPr>
-            </w:pPr>
-          </w:p>
-          <w:p>
-            <w:pPr>
-              <w:jc w:val="both"/>
-              <w:rPr>
-                <w:rFonts w:ascii="Calibri" w:hAnsi="Calibri" w:cs="Arial"/>
-                <w:i/>
-                <w:color w:val="548DD4"/>
-                <w:sz w:val="20"/>
-                <w:szCs w:val="20"/>
-                <w:lang w:eastAsia="es-CL"/>
-              </w:rPr>
-            </w:pPr>
-          </w:p>
-          <w:p>
-            <w:pPr>
-              <w:jc w:val="both"/>
-              <w:rPr>
-                <w:rFonts w:ascii="Calibri" w:hAnsi="Calibri" w:cs="Arial"/>
-                <w:i/>
-                <w:color w:val="548DD4"/>
-                <w:sz w:val="20"/>
-                <w:szCs w:val="20"/>
-                <w:lang w:eastAsia="es-CL"/>
-              </w:rPr>
-            </w:pPr>
-          </w:p>
-          <w:p>
-            <w:pPr>
-              <w:jc w:val="both"/>
-              <w:rPr>
-                <w:rFonts w:ascii="Calibri" w:hAnsi="Calibri" w:cs="Arial"/>
-                <w:i/>
-                <w:color w:val="548DD4"/>
-                <w:sz w:val="20"/>
-                <w:szCs w:val="20"/>
-                <w:lang w:eastAsia="es-CL"/>
-              </w:rPr>
-            </w:pPr>
-          </w:p>
-          <w:p>
-            <w:pPr>
-              <w:jc w:val="both"/>
-              <w:rPr>
-                <w:rFonts w:ascii="Calibri" w:hAnsi="Calibri" w:cs="Arial"/>
-                <w:i/>
-                <w:color w:val="548DD4"/>
-                <w:sz w:val="20"/>
-                <w:szCs w:val="20"/>
-                <w:lang w:eastAsia="es-CL"/>
-              </w:rPr>
-            </w:pPr>
-          </w:p>
-          <w:p>
-            <w:pPr>
-              <w:jc w:val="both"/>
-              <w:rPr>
-                <w:rFonts w:ascii="Calibri" w:hAnsi="Calibri" w:cs="Arial"/>
-                <w:i/>
-                <w:color w:val="548DD4"/>
-                <w:sz w:val="20"/>
-                <w:szCs w:val="20"/>
-                <w:lang w:eastAsia="es-CL"/>
-              </w:rPr>
-            </w:pPr>
+              <w:t xml:space="preserve"> se conecte a servicios estables y sin errores.</w:t>
+            </w:r>
+            <w:bookmarkStart w:id="0" w:name="_GoBack"/>
+            <w:bookmarkEnd w:id="0"/>
           </w:p>
           <w:p>
             <w:pPr>
@@ -4457,12 +5542,9 @@
 </file>
 
 <file path=customXml/item1.xml><?xml version="1.0" encoding="utf-8"?>
-<?mso-contentType ?>
-<FormTemplates xmlns="http://schemas.microsoft.com/sharepoint/v3/contenttype/forms">
-  <Display>DocumentLibraryForm</Display>
-  <Edit>DocumentLibraryForm</Edit>
-  <New>DocumentLibraryForm</New>
-</FormTemplates>
+<p:properties xmlns:p="http://schemas.microsoft.com/office/2006/metadata/properties" xmlns:xsi="http://www.w3.org/2001/XMLSchema-instance" xmlns:pc="http://schemas.microsoft.com/office/infopath/2007/PartnerControls">
+  <documentManagement/>
+</p:properties>
 </file>
 
 <file path=customXml/item2.xml><?xml version="1.0" encoding="utf-8"?>
@@ -4598,15 +5680,19 @@
 </file>
 
 <file path=customXml/item3.xml><?xml version="1.0" encoding="utf-8"?>
-<p:properties xmlns:p="http://schemas.microsoft.com/office/2006/metadata/properties" xmlns:xsi="http://www.w3.org/2001/XMLSchema-instance" xmlns:pc="http://schemas.microsoft.com/office/infopath/2007/PartnerControls">
-  <documentManagement/>
-</p:properties>
+<?mso-contentType ?>
+<FormTemplates xmlns="http://schemas.microsoft.com/sharepoint/v3/contenttype/forms">
+  <Display>DocumentLibraryForm</Display>
+  <Edit>DocumentLibraryForm</Edit>
+  <New>DocumentLibraryForm</New>
+</FormTemplates>
 </file>
 
 <file path=customXml/itemProps1.xml><?xml version="1.0" encoding="utf-8"?>
-<ds:datastoreItem xmlns:ds="http://schemas.openxmlformats.org/officeDocument/2006/customXml" ds:itemID="{D51C61E4-DB75-4684-AD25-71F546404E96}">
+<ds:datastoreItem xmlns:ds="http://schemas.openxmlformats.org/officeDocument/2006/customXml" ds:itemID="{46CA5683-AF87-4E40-B841-2E23A3B52406}">
   <ds:schemaRefs>
-    <ds:schemaRef ds:uri="http://schemas.microsoft.com/sharepoint/v3/contenttype/forms"/>
+    <ds:schemaRef ds:uri="http://schemas.microsoft.com/office/2006/metadata/properties"/>
+    <ds:schemaRef ds:uri="http://schemas.microsoft.com/office/infopath/2007/PartnerControls"/>
   </ds:schemaRefs>
 </ds:datastoreItem>
 </file>
@@ -4630,10 +5716,9 @@
 </file>
 
 <file path=customXml/itemProps3.xml><?xml version="1.0" encoding="utf-8"?>
-<ds:datastoreItem xmlns:ds="http://schemas.openxmlformats.org/officeDocument/2006/customXml" ds:itemID="{46CA5683-AF87-4E40-B841-2E23A3B52406}">
+<ds:datastoreItem xmlns:ds="http://schemas.openxmlformats.org/officeDocument/2006/customXml" ds:itemID="{D51C61E4-DB75-4684-AD25-71F546404E96}">
   <ds:schemaRefs>
-    <ds:schemaRef ds:uri="http://schemas.microsoft.com/office/2006/metadata/properties"/>
-    <ds:schemaRef ds:uri="http://schemas.microsoft.com/office/infopath/2007/PartnerControls"/>
+    <ds:schemaRef ds:uri="http://schemas.microsoft.com/sharepoint/v3/contenttype/forms"/>
   </ds:schemaRefs>
 </ds:datastoreItem>
 </file>
</xml_diff>